<commit_message>
feat(templates): production-grade SOP.docx system default (QA-0008)
Co-Authored-By: Claude Opus 4.7 <noreply@anthropic.com>
</commit_message>
<xml_diff>
--- a/backend/app/services/documents/templates/sop_default.docx
+++ b/backend/app/services/documents/templates/sop_default.docx
@@ -4,319 +4,848 @@
   <w:body>
     <w:p>
       <w:r>
-        <w:t>{%p if unapproved_warning %}</w:t>
-      </w:r>
-    </w:p>
-    <w:p>
-      <w:r>
-        <w:t>⚠ UNAPPROVED — DRAFT ONLY</w:t>
-      </w:r>
-    </w:p>
-    <w:p>
-      <w:r>
-        <w:t>{%p endif %}</w:t>
-      </w:r>
-    </w:p>
-    <w:p>
-      <w:pPr>
-        <w:spacing w:after="80" w:before="0"/>
-        <w:jc w:val="center"/>
-      </w:pPr>
-      <w:r>
         <w:rPr>
           <w:b/>
-          <w:i w:val="0"/>
-          <w:color w:val="0F172A"/>
           <w:sz w:val="36"/>
         </w:rPr>
         <w:t>{{ protocol_name }}</w:t>
       </w:r>
     </w:p>
     <w:p>
-      <w:pPr>
-        <w:spacing w:before="0" w:after="80"/>
-      </w:pPr>
       <w:r>
-        <w:t>{{r protocol_subtitle }}</w:t>
+        <w:rPr>
+          <w:b w:val="0"/>
+          <w:sz w:val="22"/>
+        </w:rPr>
+        <w:t>{% if doc_number %}Document #: {{ doc_number }}{% endif %}</w:t>
       </w:r>
     </w:p>
     <w:p>
-      <w:pPr>
-        <w:spacing w:after="120" w:before="0"/>
-      </w:pPr>
       <w:r>
         <w:rPr>
           <w:b w:val="0"/>
-          <w:i w:val="0"/>
-          <w:color w:val="C8C8C8"/>
-          <w:sz w:val="12"/>
+          <w:sz w:val="22"/>
         </w:rPr>
-        <w:t>──────────────────────────────────────────────────</w:t>
+        <w:t>Version {{ version_number }}  |  Effective: {{ effective_date }}  |  Supersedes: {{ supersedes_date }}</w:t>
       </w:r>
     </w:p>
     <w:p>
-      <w:pPr>
-        <w:spacing w:after="0"/>
-      </w:pPr>
       <w:r>
         <w:rPr>
           <w:b w:val="0"/>
-          <w:i w:val="0"/>
-          <w:color w:val="334155"/>
+          <w:sz w:val="22"/>
+        </w:rPr>
+        <w:t>{{ project_name }}  |  {{ organization_name }}</w:t>
+      </w:r>
+    </w:p>
+    <w:p>
+      <w:r>
+        <w:rPr>
+          <w:b w:val="0"/>
           <w:sz w:val="2"/>
+        </w:rPr>
+        <w:t>{%p if purpose %}</w:t>
+      </w:r>
+    </w:p>
+    <w:p>
+      <w:r>
+        <w:rPr>
+          <w:b/>
+          <w:sz w:val="28"/>
+        </w:rPr>
+        <w:t>Purpose</w:t>
+      </w:r>
+    </w:p>
+    <w:p>
+      <w:r>
+        <w:rPr>
+          <w:b w:val="0"/>
+          <w:sz w:val="22"/>
+        </w:rPr>
+        <w:t>{{ purpose }}</w:t>
+      </w:r>
+    </w:p>
+    <w:p>
+      <w:r>
+        <w:rPr>
+          <w:b w:val="0"/>
+          <w:sz w:val="2"/>
+        </w:rPr>
+        <w:t>{%p endif %}</w:t>
+      </w:r>
+    </w:p>
+    <w:p>
+      <w:r>
+        <w:rPr>
+          <w:b w:val="0"/>
+          <w:sz w:val="2"/>
+        </w:rPr>
+        <w:t>{%p if scope %}</w:t>
+      </w:r>
+    </w:p>
+    <w:p>
+      <w:r>
+        <w:rPr>
+          <w:b/>
+          <w:sz w:val="28"/>
+        </w:rPr>
+        <w:t>Scope</w:t>
+      </w:r>
+    </w:p>
+    <w:p>
+      <w:r>
+        <w:rPr>
+          <w:b w:val="0"/>
+          <w:sz w:val="22"/>
+        </w:rPr>
+        <w:t>{{ scope }}</w:t>
+      </w:r>
+    </w:p>
+    <w:p>
+      <w:r>
+        <w:rPr>
+          <w:b w:val="0"/>
+          <w:sz w:val="2"/>
+        </w:rPr>
+        <w:t>{%p endif %}</w:t>
+      </w:r>
+    </w:p>
+    <w:p>
+      <w:r>
+        <w:rPr>
+          <w:b w:val="0"/>
+          <w:sz w:val="2"/>
+        </w:rPr>
+        <w:t>{%p if definitions %}</w:t>
+      </w:r>
+    </w:p>
+    <w:p>
+      <w:r>
+        <w:rPr>
+          <w:b/>
+          <w:sz w:val="28"/>
+        </w:rPr>
+        <w:t>Definitions</w:t>
+      </w:r>
+    </w:p>
+    <w:p>
+      <w:r>
+        <w:rPr>
+          <w:b w:val="0"/>
+          <w:sz w:val="22"/>
+        </w:rPr>
+        <w:t>{{ definitions }}</w:t>
+      </w:r>
+    </w:p>
+    <w:p>
+      <w:r>
+        <w:rPr>
+          <w:b w:val="0"/>
+          <w:sz w:val="2"/>
+        </w:rPr>
+        <w:t>{%p endif %}</w:t>
+      </w:r>
+    </w:p>
+    <w:p>
+      <w:r>
+        <w:rPr>
+          <w:b w:val="0"/>
+          <w:sz w:val="2"/>
+        </w:rPr>
+        <w:t>{%p if references %}</w:t>
+      </w:r>
+    </w:p>
+    <w:p>
+      <w:r>
+        <w:rPr>
+          <w:b/>
+          <w:sz w:val="28"/>
+        </w:rPr>
+        <w:t>References</w:t>
+      </w:r>
+    </w:p>
+    <w:p>
+      <w:r>
+        <w:rPr>
+          <w:b w:val="0"/>
+          <w:sz w:val="22"/>
+        </w:rPr>
+        <w:t>{{ references }}</w:t>
+      </w:r>
+    </w:p>
+    <w:p>
+      <w:r>
+        <w:rPr>
+          <w:b w:val="0"/>
+          <w:sz w:val="2"/>
+        </w:rPr>
+        <w:t>{%p endif %}</w:t>
+      </w:r>
+    </w:p>
+    <w:p>
+      <w:r>
+        <w:rPr>
+          <w:b w:val="0"/>
+          <w:sz w:val="2"/>
+        </w:rPr>
+        <w:t>{%p if revision_history %}</w:t>
+      </w:r>
+    </w:p>
+    <w:p>
+      <w:r>
+        <w:rPr>
+          <w:b/>
+          <w:sz w:val="28"/>
+        </w:rPr>
+        <w:t>Revision History</w:t>
+      </w:r>
+    </w:p>
+    <w:tbl>
+      <w:tblPr>
+        <w:tblStyle w:val="LightGrid-Accent1"/>
+        <w:tblW w:type="auto" w:w="0"/>
+        <w:tblLook w:firstColumn="1" w:firstRow="1" w:lastColumn="0" w:lastRow="0" w:noHBand="0" w:noVBand="1" w:val="04A0"/>
+      </w:tblPr>
+      <w:tblGrid>
+        <w:gridCol w:w="2493"/>
+        <w:gridCol w:w="2493"/>
+        <w:gridCol w:w="2493"/>
+        <w:gridCol w:w="2493"/>
+      </w:tblGrid>
+      <w:tr>
+        <w:tc>
+          <w:tcPr>
+            <w:tcW w:type="dxa" w:w="2493"/>
+          </w:tcPr>
+          <w:p>
+            <w:r>
+              <w:t>Version</w:t>
+            </w:r>
+          </w:p>
+        </w:tc>
+        <w:tc>
+          <w:tcPr>
+            <w:tcW w:type="dxa" w:w="2493"/>
+          </w:tcPr>
+          <w:p>
+            <w:r>
+              <w:t>Date</w:t>
+            </w:r>
+          </w:p>
+        </w:tc>
+        <w:tc>
+          <w:tcPr>
+            <w:tcW w:type="dxa" w:w="2493"/>
+          </w:tcPr>
+          <w:p>
+            <w:r>
+              <w:t>Author</w:t>
+            </w:r>
+          </w:p>
+        </w:tc>
+        <w:tc>
+          <w:tcPr>
+            <w:tcW w:type="dxa" w:w="2493"/>
+          </w:tcPr>
+          <w:p>
+            <w:r>
+              <w:t>Changes</w:t>
+            </w:r>
+          </w:p>
+        </w:tc>
+      </w:tr>
+      <w:tr>
+        <w:tc>
+          <w:tcPr>
+            <w:tcW w:type="dxa" w:w="2493"/>
+          </w:tcPr>
+          <w:p>
+            <w:r>
+              <w:t>{%tr for rev in revision_history %}</w:t>
+            </w:r>
+          </w:p>
+        </w:tc>
+        <w:tc>
+          <w:tcPr>
+            <w:tcW w:type="dxa" w:w="2493"/>
+          </w:tcPr>
+          <w:p/>
+        </w:tc>
+        <w:tc>
+          <w:tcPr>
+            <w:tcW w:type="dxa" w:w="2493"/>
+          </w:tcPr>
+          <w:p/>
+        </w:tc>
+        <w:tc>
+          <w:tcPr>
+            <w:tcW w:type="dxa" w:w="2493"/>
+          </w:tcPr>
+          <w:p/>
+        </w:tc>
+      </w:tr>
+      <w:tr>
+        <w:tc>
+          <w:tcPr>
+            <w:tcW w:type="dxa" w:w="2493"/>
+          </w:tcPr>
+          <w:p>
+            <w:r>
+              <w:t>{{ rev.version_number }}</w:t>
+            </w:r>
+          </w:p>
+        </w:tc>
+        <w:tc>
+          <w:tcPr>
+            <w:tcW w:type="dxa" w:w="2493"/>
+          </w:tcPr>
+          <w:p>
+            <w:r>
+              <w:t>{{ rev.created_at }}</w:t>
+            </w:r>
+          </w:p>
+        </w:tc>
+        <w:tc>
+          <w:tcPr>
+            <w:tcW w:type="dxa" w:w="2493"/>
+          </w:tcPr>
+          <w:p>
+            <w:r>
+              <w:t>{{ rev.created_by }}</w:t>
+            </w:r>
+          </w:p>
+        </w:tc>
+        <w:tc>
+          <w:tcPr>
+            <w:tcW w:type="dxa" w:w="2493"/>
+          </w:tcPr>
+          <w:p>
+            <w:r>
+              <w:t>{{ rev.change_summary }}</w:t>
+            </w:r>
+          </w:p>
+        </w:tc>
+      </w:tr>
+      <w:tr>
+        <w:tc>
+          <w:tcPr>
+            <w:tcW w:type="dxa" w:w="2493"/>
+          </w:tcPr>
+          <w:p>
+            <w:r>
+              <w:t>{%tr endfor %}</w:t>
+            </w:r>
+          </w:p>
+        </w:tc>
+        <w:tc>
+          <w:tcPr>
+            <w:tcW w:type="dxa" w:w="2493"/>
+          </w:tcPr>
+          <w:p/>
+        </w:tc>
+        <w:tc>
+          <w:tcPr>
+            <w:tcW w:type="dxa" w:w="2493"/>
+          </w:tcPr>
+          <w:p/>
+        </w:tc>
+        <w:tc>
+          <w:tcPr>
+            <w:tcW w:type="dxa" w:w="2493"/>
+          </w:tcPr>
+          <w:p/>
+        </w:tc>
+      </w:tr>
+    </w:tbl>
+    <w:p>
+      <w:r>
+        <w:rPr>
+          <w:b w:val="0"/>
+          <w:sz w:val="2"/>
+        </w:rPr>
+        <w:t>{%p endif %}</w:t>
+      </w:r>
+    </w:p>
+    <w:p>
+      <w:r>
+        <w:rPr>
+          <w:b w:val="0"/>
+          <w:sz w:val="2"/>
+        </w:rPr>
+        <w:t>{%p if responsibilities %}</w:t>
+      </w:r>
+    </w:p>
+    <w:p>
+      <w:r>
+        <w:rPr>
+          <w:b/>
+          <w:sz w:val="28"/>
+        </w:rPr>
+        <w:t>Responsibilities</w:t>
+      </w:r>
+    </w:p>
+    <w:tbl>
+      <w:tblPr>
+        <w:tblStyle w:val="LightGrid-Accent1"/>
+        <w:tblW w:type="auto" w:w="0"/>
+        <w:tblLook w:firstColumn="1" w:firstRow="1" w:lastColumn="0" w:lastRow="0" w:noHBand="0" w:noVBand="1" w:val="04A0"/>
+      </w:tblPr>
+      <w:tblGrid>
+        <w:gridCol w:w="4986"/>
+        <w:gridCol w:w="4986"/>
+      </w:tblGrid>
+      <w:tr>
+        <w:tc>
+          <w:tcPr>
+            <w:tcW w:type="dxa" w:w="4986"/>
+          </w:tcPr>
+          <w:p>
+            <w:r>
+              <w:t>Role</w:t>
+            </w:r>
+          </w:p>
+        </w:tc>
+        <w:tc>
+          <w:tcPr>
+            <w:tcW w:type="dxa" w:w="4986"/>
+          </w:tcPr>
+          <w:p>
+            <w:r>
+              <w:t>Responsibility summary</w:t>
+            </w:r>
+          </w:p>
+        </w:tc>
+      </w:tr>
+      <w:tr>
+        <w:tc>
+          <w:tcPr>
+            <w:tcW w:type="dxa" w:w="4986"/>
+          </w:tcPr>
+          <w:p>
+            <w:r>
+              <w:t>{%tr for resp in responsibilities %}</w:t>
+            </w:r>
+          </w:p>
+        </w:tc>
+        <w:tc>
+          <w:tcPr>
+            <w:tcW w:type="dxa" w:w="4986"/>
+          </w:tcPr>
+          <w:p/>
+        </w:tc>
+      </w:tr>
+      <w:tr>
+        <w:tc>
+          <w:tcPr>
+            <w:tcW w:type="dxa" w:w="4986"/>
+          </w:tcPr>
+          <w:p>
+            <w:r>
+              <w:t>{{ resp.role_name }}</w:t>
+            </w:r>
+          </w:p>
+        </w:tc>
+        <w:tc>
+          <w:tcPr>
+            <w:tcW w:type="dxa" w:w="4986"/>
+          </w:tcPr>
+          <w:p>
+            <w:r>
+              <w:t>{{ resp.step_summary }}</w:t>
+            </w:r>
+          </w:p>
+        </w:tc>
+      </w:tr>
+      <w:tr>
+        <w:tc>
+          <w:tcPr>
+            <w:tcW w:type="dxa" w:w="4986"/>
+          </w:tcPr>
+          <w:p>
+            <w:r>
+              <w:t>{%tr endfor %}</w:t>
+            </w:r>
+          </w:p>
+        </w:tc>
+        <w:tc>
+          <w:tcPr>
+            <w:tcW w:type="dxa" w:w="4986"/>
+          </w:tcPr>
+          <w:p/>
+        </w:tc>
+      </w:tr>
+    </w:tbl>
+    <w:p>
+      <w:r>
+        <w:rPr>
+          <w:b w:val="0"/>
+          <w:sz w:val="2"/>
+        </w:rPr>
+        <w:t>{%p endif %}</w:t>
+      </w:r>
+    </w:p>
+    <w:p>
+      <w:r>
+        <w:rPr>
+          <w:b w:val="0"/>
+          <w:sz w:val="2"/>
+        </w:rPr>
+        <w:t>{%p if equipment_summary %}</w:t>
+      </w:r>
+    </w:p>
+    <w:p>
+      <w:r>
+        <w:rPr>
+          <w:b/>
+          <w:sz w:val="28"/>
+        </w:rPr>
+        <w:t>Equipment</w:t>
+      </w:r>
+    </w:p>
+    <w:tbl>
+      <w:tblPr>
+        <w:tblStyle w:val="LightGrid-Accent1"/>
+        <w:tblW w:type="auto" w:w="0"/>
+        <w:tblLook w:firstColumn="1" w:firstRow="1" w:lastColumn="0" w:lastRow="0" w:noHBand="0" w:noVBand="1" w:val="04A0"/>
+      </w:tblPr>
+      <w:tblGrid>
+        <w:gridCol w:w="3324"/>
+        <w:gridCol w:w="3324"/>
+        <w:gridCol w:w="3324"/>
+      </w:tblGrid>
+      <w:tr>
+        <w:tc>
+          <w:tcPr>
+            <w:tcW w:type="dxa" w:w="3324"/>
+          </w:tcPr>
+          <w:p>
+            <w:r>
+              <w:t>ID</w:t>
+            </w:r>
+          </w:p>
+        </w:tc>
+        <w:tc>
+          <w:tcPr>
+            <w:tcW w:type="dxa" w:w="3324"/>
+          </w:tcPr>
+          <w:p>
+            <w:r>
+              <w:t>Name</w:t>
+            </w:r>
+          </w:p>
+        </w:tc>
+        <w:tc>
+          <w:tcPr>
+            <w:tcW w:type="dxa" w:w="3324"/>
+          </w:tcPr>
+          <w:p>
+            <w:r>
+              <w:t>Description</w:t>
+            </w:r>
+          </w:p>
+        </w:tc>
+      </w:tr>
+      <w:tr>
+        <w:tc>
+          <w:tcPr>
+            <w:tcW w:type="dxa" w:w="3324"/>
+          </w:tcPr>
+          <w:p>
+            <w:r>
+              <w:t>{%tr for eq in equipment_summary %}</w:t>
+            </w:r>
+          </w:p>
+        </w:tc>
+        <w:tc>
+          <w:tcPr>
+            <w:tcW w:type="dxa" w:w="3324"/>
+          </w:tcPr>
+          <w:p/>
+        </w:tc>
+        <w:tc>
+          <w:tcPr>
+            <w:tcW w:type="dxa" w:w="3324"/>
+          </w:tcPr>
+          <w:p/>
+        </w:tc>
+      </w:tr>
+      <w:tr>
+        <w:tc>
+          <w:tcPr>
+            <w:tcW w:type="dxa" w:w="3324"/>
+          </w:tcPr>
+          <w:p>
+            <w:r>
+              <w:t>{{ eq.local_id }}</w:t>
+            </w:r>
+          </w:p>
+        </w:tc>
+        <w:tc>
+          <w:tcPr>
+            <w:tcW w:type="dxa" w:w="3324"/>
+          </w:tcPr>
+          <w:p>
+            <w:r>
+              <w:t>{{ eq.name }}</w:t>
+            </w:r>
+          </w:p>
+        </w:tc>
+        <w:tc>
+          <w:tcPr>
+            <w:tcW w:type="dxa" w:w="3324"/>
+          </w:tcPr>
+          <w:p>
+            <w:r>
+              <w:t>{{ eq.description }}</w:t>
+            </w:r>
+          </w:p>
+        </w:tc>
+      </w:tr>
+      <w:tr>
+        <w:tc>
+          <w:tcPr>
+            <w:tcW w:type="dxa" w:w="3324"/>
+          </w:tcPr>
+          <w:p>
+            <w:r>
+              <w:t>{%tr endfor %}</w:t>
+            </w:r>
+          </w:p>
+        </w:tc>
+        <w:tc>
+          <w:tcPr>
+            <w:tcW w:type="dxa" w:w="3324"/>
+          </w:tcPr>
+          <w:p/>
+        </w:tc>
+        <w:tc>
+          <w:tcPr>
+            <w:tcW w:type="dxa" w:w="3324"/>
+          </w:tcPr>
+          <w:p/>
+        </w:tc>
+      </w:tr>
+    </w:tbl>
+    <w:p>
+      <w:r>
+        <w:rPr>
+          <w:b w:val="0"/>
+          <w:sz w:val="2"/>
+        </w:rPr>
+        <w:t>{%p endif %}</w:t>
+      </w:r>
+    </w:p>
+    <w:p>
+      <w:r>
+        <w:rPr>
+          <w:b/>
+          <w:sz w:val="28"/>
+        </w:rPr>
+        <w:t>Procedure</w:t>
+      </w:r>
+    </w:p>
+    <w:p>
+      <w:r>
+        <w:rPr>
+          <w:b w:val="0"/>
+          <w:sz w:val="22"/>
+        </w:rPr>
+        <w:t>{%p if is_role_based %}</w:t>
+      </w:r>
+    </w:p>
+    <w:p>
+      <w:r>
+        <w:rPr>
+          <w:b w:val="0"/>
+          <w:sz w:val="22"/>
         </w:rPr>
         <w:t>{%p for role in roles %}</w:t>
       </w:r>
     </w:p>
     <w:p>
-      <w:pPr>
-        <w:spacing w:before="0" w:after="80"/>
-      </w:pPr>
       <w:r>
+        <w:rPr>
+          <w:b w:val="0"/>
+          <w:sz w:val="22"/>
+        </w:rPr>
         <w:t>{{r role.sop_header }}</w:t>
       </w:r>
     </w:p>
     <w:p>
-      <w:pPr>
-        <w:spacing w:after="0"/>
-      </w:pPr>
       <w:r>
         <w:rPr>
           <w:b w:val="0"/>
-          <w:i w:val="0"/>
-          <w:color w:val="334155"/>
-          <w:sz w:val="2"/>
+          <w:sz w:val="22"/>
         </w:rPr>
         <w:t>{%p for step in role.sop_steps %}</w:t>
       </w:r>
     </w:p>
     <w:p>
-      <w:pPr>
-        <w:spacing w:after="40"/>
-      </w:pPr>
       <w:r>
         <w:rPr>
-          <w:b/>
-          <w:i w:val="0"/>
-          <w:color w:val="0F172A"/>
+          <w:b w:val="0"/>
           <w:sz w:val="22"/>
         </w:rPr>
-        <w:t>{{ loop.index }}. {{ step.name }}</w:t>
-      </w:r>
-    </w:p>
-    <w:p>
-      <w:pPr>
-        <w:spacing w:before="0" w:after="100"/>
-      </w:pPr>
-      <w:r>
         <w:t>{{r step.sop_body }}</w:t>
       </w:r>
     </w:p>
     <w:p>
-      <w:pPr>
-        <w:spacing w:after="0"/>
-      </w:pPr>
       <w:r>
         <w:rPr>
           <w:b w:val="0"/>
-          <w:i w:val="0"/>
-          <w:color w:val="334155"/>
-          <w:sz w:val="2"/>
+          <w:sz w:val="22"/>
         </w:rPr>
         <w:t>{%p endfor %}</w:t>
       </w:r>
     </w:p>
     <w:p>
-      <w:pPr>
-        <w:spacing w:after="0"/>
-      </w:pPr>
       <w:r>
         <w:rPr>
           <w:b w:val="0"/>
-          <w:i w:val="0"/>
-          <w:color w:val="334155"/>
-          <w:sz w:val="2"/>
+          <w:sz w:val="22"/>
         </w:rPr>
         <w:t>{%p endfor %}</w:t>
       </w:r>
     </w:p>
     <w:p>
-      <w:pPr>
-        <w:spacing w:after="0"/>
-      </w:pPr>
       <w:r>
         <w:rPr>
           <w:b w:val="0"/>
-          <w:i w:val="0"/>
-          <w:color w:val="334155"/>
-          <w:sz w:val="2"/>
-        </w:rPr>
-        <w:t>{{r page_break }}</w:t>
-      </w:r>
-    </w:p>
-    <w:p>
-      <w:pPr>
-        <w:spacing w:after="120" w:before="0"/>
-      </w:pPr>
-      <w:r>
-        <w:rPr>
-          <w:b w:val="0"/>
-          <w:i w:val="0"/>
-          <w:color w:val="C8C8C8"/>
-          <w:sz w:val="12"/>
-        </w:rPr>
-        <w:t>──────────────────────────────────────────────────</w:t>
-      </w:r>
-    </w:p>
-    <w:p>
-      <w:pPr>
-        <w:spacing w:after="320" w:before="0"/>
-      </w:pPr>
-      <w:r>
-        <w:rPr>
-          <w:b/>
-          <w:i w:val="0"/>
-          <w:color w:val="0F172A"/>
           <w:sz w:val="22"/>
         </w:rPr>
-        <w:t>Approvals</w:t>
-      </w:r>
-    </w:p>
-    <w:p>
-      <w:pPr>
-        <w:spacing w:after="40"/>
-      </w:pPr>
-      <w:r>
-        <w:rPr>
-          <w:color w:val="787878"/>
-          <w:sz w:val="18"/>
-        </w:rPr>
-        <w:t>____________________________</w:t>
-        <w:tab/>
-        <w:tab/>
-        <w:tab/>
-      </w:r>
-      <w:r>
-        <w:rPr>
-          <w:color w:val="787878"/>
-          <w:sz w:val="18"/>
-        </w:rPr>
-        <w:t>____________________________</w:t>
+        <w:t>{%p else %}</w:t>
       </w:r>
     </w:p>
     <w:p>
       <w:r>
         <w:rPr>
-          <w:color w:val="787878"/>
-          <w:sz w:val="18"/>
+          <w:b w:val="0"/>
+          <w:sz w:val="22"/>
         </w:rPr>
-        <w:t>Prepared by (Name / Date)</w:t>
-        <w:tab/>
-        <w:tab/>
-      </w:r>
-      <w:r>
-        <w:rPr>
-          <w:color w:val="787878"/>
-          <w:sz w:val="18"/>
-        </w:rPr>
-        <w:t>Reviewed by (Name / Date)</w:t>
+        <w:t>{%p for step in steps %}</w:t>
       </w:r>
     </w:p>
     <w:p>
       <w:r>
-        <w:t>{# BR-APPROVAL-BLOCK #}</w:t>
+        <w:rPr>
+          <w:b w:val="0"/>
+          <w:sz w:val="22"/>
+        </w:rPr>
+        <w:t>{{r step.sop_body }}</w:t>
       </w:r>
     </w:p>
     <w:p>
       <w:r>
+        <w:rPr>
+          <w:b w:val="0"/>
+          <w:sz w:val="22"/>
+        </w:rPr>
+        <w:t>{%p endfor %}</w:t>
+      </w:r>
+    </w:p>
+    <w:p>
+      <w:r>
+        <w:rPr>
+          <w:b w:val="0"/>
+          <w:sz w:val="22"/>
+        </w:rPr>
+        <w:t>{%p endif %}</w:t>
+      </w:r>
+    </w:p>
+    <w:p>
+      <w:r>
+        <w:rPr>
+          <w:b/>
+          <w:sz w:val="28"/>
+        </w:rPr>
+        <w:t>Approval</w:t>
+      </w:r>
+    </w:p>
+    <w:p>
+      <w:r>
+        <w:rPr>
+          <w:b w:val="0"/>
+          <w:sz w:val="22"/>
+        </w:rPr>
         <w:t>{%p if approval %}</w:t>
       </w:r>
     </w:p>
     <w:p>
       <w:r>
-        <w:t>Approval &amp; Signatures</w:t>
+        <w:rPr>
+          <w:b w:val="0"/>
+          <w:sz w:val="22"/>
+        </w:rPr>
+        <w:t>Approved by: {{ approval.actor_name }} ({{ approval.actor_role }})</w:t>
       </w:r>
     </w:p>
     <w:p>
       <w:r>
-        <w:t>Approver: {{ approval.approver_name }} &lt;{{ approval.approver_email }}&gt;</w:t>
+        <w:rPr>
+          <w:b w:val="0"/>
+          <w:sz w:val="22"/>
+        </w:rPr>
+        <w:t>Date: {{ approval.approved_at }}</w:t>
       </w:r>
     </w:p>
     <w:p>
       <w:r>
-        <w:t>Approved at: {{ approval.approved_at }}    Protocol version: {{ approval.protocol_version }}</w:t>
-      </w:r>
-    </w:p>
-    <w:p>
-      <w:r>
+        <w:rPr>
+          <w:b w:val="0"/>
+          <w:sz w:val="22"/>
+        </w:rPr>
         <w:t>{%p if approval.signature_statement %}</w:t>
       </w:r>
     </w:p>
     <w:p>
       <w:r>
+        <w:rPr>
+          <w:b w:val="0"/>
+          <w:sz w:val="22"/>
+        </w:rPr>
         <w:t>Statement: {{ approval.signature_statement }}</w:t>
       </w:r>
     </w:p>
     <w:p>
       <w:r>
+        <w:rPr>
+          <w:b w:val="0"/>
+          <w:sz w:val="22"/>
+        </w:rPr>
         <w:t>{%p endif %}</w:t>
       </w:r>
     </w:p>
     <w:p>
       <w:r>
-        <w:t>{%p if approval.signature_image %}</w:t>
+        <w:rPr>
+          <w:b w:val="0"/>
+          <w:sz w:val="22"/>
+        </w:rPr>
+        <w:t>{%p else %}</w:t>
       </w:r>
     </w:p>
     <w:p>
       <w:r>
-        <w:t>Signature: {{ approval.signature_image }}</w:t>
+        <w:rPr>
+          <w:b w:val="0"/>
+          <w:sz w:val="22"/>
+        </w:rPr>
+        <w:t>{{ unapproved_warning }}</w:t>
       </w:r>
     </w:p>
     <w:p>
       <w:r>
-        <w:t>{%p endif %}</w:t>
-      </w:r>
-    </w:p>
-    <w:p>
-      <w:r>
-        <w:t>{%p endif %}</w:t>
-      </w:r>
-    </w:p>
-    <w:p>
-      <w:r>
-        <w:t>{%p if approval_history %}</w:t>
-      </w:r>
-    </w:p>
-    <w:p>
-      <w:r>
-        <w:t>Approval History</w:t>
-      </w:r>
-    </w:p>
-    <w:p>
-      <w:r>
-        <w:t>{%p for ev in approval_history %}</w:t>
-      </w:r>
-    </w:p>
-    <w:p>
-      <w:r>
-        <w:t>{{ ev.created_at }} — {{ ev.action }} by {{ ev.actor_name }}</w:t>
-      </w:r>
-    </w:p>
-    <w:p>
-      <w:r>
-        <w:t>{%p endfor %}</w:t>
-      </w:r>
-    </w:p>
-    <w:p>
-      <w:r>
+        <w:rPr>
+          <w:b w:val="0"/>
+          <w:sz w:val="22"/>
+        </w:rPr>
         <w:t>{%p endif %}</w:t>
       </w:r>
     </w:p>
     <w:sectPr>
       <w:headerReference w:type="default" r:id="rId9"/>
-      <w:footerReference w:type="default" r:id="rId10"/>
       <w:pgSz w:w="12240" w:h="15840"/>
-      <w:pgMar w:top="1440" w:right="1440" w:bottom="1440" w:left="1440" w:header="720" w:footer="720" w:gutter="0"/>
+      <w:pgMar w:top="1134" w:right="1134" w:bottom="1134" w:left="1134" w:header="720" w:footer="720" w:gutter="0"/>
       <w:cols w:space="720"/>
       <w:docGrid w:linePitch="360"/>
     </w:sectPr>
@@ -324,63 +853,14 @@
 </w:document>
 </file>
 
-<file path=word/footer1.xml><?xml version="1.0" encoding="utf-8"?>
-<w:ftr xmlns:m="http://schemas.openxmlformats.org/officeDocument/2006/math" xmlns:mc="http://schemas.openxmlformats.org/markup-compatibility/2006" xmlns:mo="http://schemas.microsoft.com/office/mac/office/2008/main" xmlns:mv="urn:schemas-microsoft-com:mac:vml" xmlns:o="urn:schemas-microsoft-com:office:office" xmlns:r="http://schemas.openxmlformats.org/officeDocument/2006/relationships" xmlns:v="urn:schemas-microsoft-com:vml" xmlns:w10="urn:schemas-microsoft-com:office:word" xmlns:w14="http://schemas.microsoft.com/office/word/2010/wordml" xmlns:w="http://schemas.openxmlformats.org/wordprocessingml/2006/main" xmlns:wne="http://schemas.microsoft.com/office/word/2006/wordml" xmlns:wp14="http://schemas.microsoft.com/office/word/2010/wordprocessingDrawing" xmlns:wp="http://schemas.openxmlformats.org/drawingml/2006/wordprocessingDrawing" xmlns:wpc="http://schemas.microsoft.com/office/word/2010/wordprocessingCanvas" xmlns:wpg="http://schemas.microsoft.com/office/word/2010/wordprocessingGroup" xmlns:wpi="http://schemas.microsoft.com/office/word/2010/wordprocessingInk" xmlns:wps="http://schemas.microsoft.com/office/word/2010/wordprocessingShape" mc:Ignorable="w14 wp14">
-  <w:p>
-    <w:pPr>
-      <w:pStyle w:val="Footer"/>
-      <w:jc w:val="center"/>
-    </w:pPr>
-    <w:r>
-      <w:rPr>
-        <w:color w:val="969696"/>
-        <w:sz w:val="16"/>
-      </w:rPr>
-      <w:t xml:space="preserve">Page </w:t>
-      <w:fldChar w:fldCharType="begin"/>
-      <w:instrText> PAGE </w:instrText>
-      <w:fldChar w:fldCharType="end"/>
-    </w:r>
-    <w:r>
-      <w:rPr>
-        <w:color w:val="969696"/>
-        <w:sz w:val="16"/>
-      </w:rPr>
-      <w:t xml:space="preserve"> / </w:t>
-      <w:fldChar w:fldCharType="begin"/>
-      <w:instrText> NUMPAGES </w:instrText>
-      <w:fldChar w:fldCharType="end"/>
-    </w:r>
-  </w:p>
-</w:ftr>
-</file>
-
 <file path=word/header1.xml><?xml version="1.0" encoding="utf-8"?>
 <w:hdr xmlns:m="http://schemas.openxmlformats.org/officeDocument/2006/math" xmlns:mc="http://schemas.openxmlformats.org/markup-compatibility/2006" xmlns:mo="http://schemas.microsoft.com/office/mac/office/2008/main" xmlns:mv="urn:schemas-microsoft-com:mac:vml" xmlns:o="urn:schemas-microsoft-com:office:office" xmlns:r="http://schemas.openxmlformats.org/officeDocument/2006/relationships" xmlns:v="urn:schemas-microsoft-com:vml" xmlns:w10="urn:schemas-microsoft-com:office:word" xmlns:w14="http://schemas.microsoft.com/office/word/2010/wordml" xmlns:w="http://schemas.openxmlformats.org/wordprocessingml/2006/main" xmlns:wne="http://schemas.microsoft.com/office/word/2006/wordml" xmlns:wp14="http://schemas.microsoft.com/office/word/2010/wordprocessingDrawing" xmlns:wp="http://schemas.openxmlformats.org/drawingml/2006/wordprocessingDrawing" xmlns:wpc="http://schemas.microsoft.com/office/word/2010/wordprocessingCanvas" xmlns:wpg="http://schemas.microsoft.com/office/word/2010/wordprocessingGroup" xmlns:wpi="http://schemas.microsoft.com/office/word/2010/wordprocessingInk" xmlns:wps="http://schemas.microsoft.com/office/word/2010/wordprocessingShape" mc:Ignorable="w14 wp14">
   <w:p>
     <w:pPr>
       <w:pStyle w:val="Header"/>
-      <w:tabs>
-        <w:tab w:pos="9360" w:val="right"/>
-      </w:tabs>
-      <w:jc w:val="left"/>
     </w:pPr>
     <w:r>
-      <w:rPr>
-        <w:i/>
-        <w:color w:val="787878"/>
-        <w:sz w:val="18"/>
-      </w:rPr>
-      <w:t>STANDARD OPERATING PROCEDURE</w:t>
-      <w:tab/>
-    </w:r>
-    <w:r>
-      <w:rPr>
-        <w:i/>
-        <w:color w:val="787878"/>
-        <w:sz w:val="18"/>
-      </w:rPr>
-      <w:t>{% if version_number %}v{{ version_number }}{% endif %}{% if version_number and created_at %}  |  {% endif %}{{ created_at }}</w:t>
+      <w:t>{{ organization_name }}    {% if doc_number %}{{ doc_number }}{% endif %}    Version {{ version_number }}</w:t>
     </w:r>
   </w:p>
 </w:hdr>

</xml_diff>

<commit_message>
feat(templates): SOP procedure as numbered list with bold step names
Procedure paragraphs now emit '{{ loop.index }}. <bold step name> —
<description>' with sub-lines (param sentence + duration hint)
hanging indented underneath. Numbering restarts per role on the
role-based branch and runs sequentially on the flat branch.

Rebuilt sop_default.docx and regenerated all permutation artifacts.

QA-0008.

Co-Authored-By: Claude Opus 4.7 <noreply@anthropic.com>
</commit_message>
<xml_diff>
--- a/backend/app/services/documents/templates/sop_default.docx
+++ b/backend/app/services/documents/templates/sop_default.docx
@@ -686,7 +686,7 @@
           <w:b w:val="0"/>
           <w:sz w:val="22"/>
         </w:rPr>
-        <w:t>{{r step.sop_body }}</w:t>
+        <w:t>{{ loop.index }}. {{r step.sop_body }}</w:t>
       </w:r>
     </w:p>
     <w:p>
@@ -731,7 +731,7 @@
           <w:b w:val="0"/>
           <w:sz w:val="22"/>
         </w:rPr>
-        <w:t>{{r step.sop_body }}</w:t>
+        <w:t>{{ loop.index }}. {{r step.sop_body }}</w:t>
       </w:r>
     </w:p>
     <w:p>

</xml_diff>

<commit_message>
feat(templates): SOP time-course mode + bioreactor styling
Redesigned sop_default.docx to match the bioreactor time-course SOP
example: navy section headings with horizontal rules, light-gray KV
header table (Doc #/Revision/Title/Effective Date), red CRITICAL
REQUIREMENT callout, and bordered figure boxes with caption + italic
description.

New ``is_time_based`` render branch produces a 3.x time-point block
per entry with optional per-step figure and a Time Target / Action /
Expected Output / Log matrix. Falls back to role-based or flat-step
tables when ``is_time_based`` is false.

Template engine: added SOP-specific known variables, build_context
kwargs, and per-time-point InlineImage handling that mirrors the
batch-record figure path (re-resolves image refs on each render).

Co-Authored-By: Claude Opus 4.7 <noreply@anthropic.com>
</commit_message>
<xml_diff>
--- a/backend/app/services/documents/templates/sop_default.docx
+++ b/backend/app/services/documents/templates/sop_default.docx
@@ -3,387 +3,2547 @@
 <w:document xmlns:wpc="http://schemas.microsoft.com/office/word/2010/wordprocessingCanvas" xmlns:mo="http://schemas.microsoft.com/office/mac/office/2008/main" xmlns:mc="http://schemas.openxmlformats.org/markup-compatibility/2006" xmlns:mv="urn:schemas-microsoft-com:mac:vml" xmlns:o="urn:schemas-microsoft-com:office:office" xmlns:r="http://schemas.openxmlformats.org/officeDocument/2006/relationships" xmlns:m="http://schemas.openxmlformats.org/officeDocument/2006/math" xmlns:v="urn:schemas-microsoft-com:vml" xmlns:wp14="http://schemas.microsoft.com/office/word/2010/wordprocessingDrawing" xmlns:wp="http://schemas.openxmlformats.org/drawingml/2006/wordprocessingDrawing" xmlns:w10="urn:schemas-microsoft-com:office:word" xmlns:w="http://schemas.openxmlformats.org/wordprocessingml/2006/main" xmlns:w14="http://schemas.microsoft.com/office/word/2010/wordml" xmlns:wpg="http://schemas.microsoft.com/office/word/2010/wordprocessingGroup" xmlns:wpi="http://schemas.microsoft.com/office/word/2010/wordprocessingInk" xmlns:wne="http://schemas.microsoft.com/office/word/2006/wordml" xmlns:wps="http://schemas.microsoft.com/office/word/2010/wordprocessingShape" mc:Ignorable="w14 wp14">
   <w:body>
     <w:p>
+      <w:pPr>
+        <w:spacing w:before="0" w:after="0"/>
+      </w:pPr>
       <w:r>
+        <w:rPr>
+          <w:rFonts w:ascii="Arial" w:hAnsi="Arial" w:cs="Arial"/>
+          <w:b w:val="0"/>
+          <w:i w:val="0"/>
+          <w:color w:val="5F6368"/>
+          <w:sz w:val="16"/>
+        </w:rPr>
         <w:t>{%p if unapproved_warning %}</w:t>
       </w:r>
     </w:p>
     <w:p>
+      <w:pPr>
+        <w:jc w:val="center"/>
+      </w:pPr>
       <w:r>
+        <w:rPr>
+          <w:rFonts w:ascii="Arial" w:hAnsi="Arial" w:cs="Arial"/>
+          <w:b/>
+          <w:i w:val="0"/>
+          <w:color w:val="B91C1C"/>
+          <w:sz w:val="22"/>
+        </w:rPr>
         <w:t>⚠ UNAPPROVED — DRAFT ONLY</w:t>
       </w:r>
     </w:p>
     <w:p>
+      <w:pPr>
+        <w:spacing w:before="0" w:after="0"/>
+      </w:pPr>
       <w:r>
+        <w:rPr>
+          <w:rFonts w:ascii="Arial" w:hAnsi="Arial" w:cs="Arial"/>
+          <w:b w:val="0"/>
+          <w:i w:val="0"/>
+          <w:color w:val="5F6368"/>
+          <w:sz w:val="16"/>
+        </w:rPr>
         <w:t>{%p endif %}</w:t>
       </w:r>
     </w:p>
     <w:p>
       <w:pPr>
-        <w:spacing w:after="80" w:before="0"/>
+        <w:spacing w:after="120"/>
         <w:jc w:val="center"/>
       </w:pPr>
       <w:r>
         <w:rPr>
-          <w:b/>
+          <w:rFonts w:ascii="Arial" w:hAnsi="Arial" w:cs="Arial"/>
+          <w:b w:val="0"/>
           <w:i w:val="0"/>
-          <w:color w:val="0F172A"/>
-          <w:sz w:val="36"/>
+          <w:color w:val="5F6368"/>
+          <w:sz w:val="24"/>
         </w:rPr>
-        <w:t>{{ protocol_name }}</w:t>
+        <w:t>Standard Operating Procedure</w:t>
+      </w:r>
+    </w:p>
+    <w:tbl>
+      <w:tblPr>
+        <w:tblW w:type="auto" w:w="0"/>
+        <w:tblLook w:firstColumn="1" w:firstRow="1" w:lastColumn="0" w:lastRow="0" w:noHBand="0" w:noVBand="1" w:val="04A0"/>
+        <w:tblLayout w:type="fixed"/>
+      </w:tblPr>
+      <w:tblGrid>
+        <w:gridCol w:w="2520"/>
+        <w:gridCol w:w="2520"/>
+        <w:gridCol w:w="2520"/>
+        <w:gridCol w:w="2520"/>
+      </w:tblGrid>
+      <w:tr>
+        <w:tc>
+          <w:tcPr>
+            <w:tcW w:type="dxa" w:w="2400"/>
+            <w:shd w:val="clear" w:color="auto" w:fill="ECF0F1"/>
+            <w:tcBorders>
+              <w:top w:val="single" w:sz="4" w:color="BFBFBF"/>
+              <w:left w:val="single" w:sz="4" w:color="BFBFBF"/>
+              <w:bottom w:val="single" w:sz="4" w:color="BFBFBF"/>
+              <w:right w:val="single" w:sz="4" w:color="BFBFBF"/>
+            </w:tcBorders>
+            <w:vAlign w:val="center"/>
+          </w:tcPr>
+          <w:p>
+            <w:r/>
+            <w:r>
+              <w:rPr>
+                <w:rFonts w:ascii="Arial" w:hAnsi="Arial" w:cs="Arial"/>
+                <w:b/>
+                <w:i w:val="0"/>
+                <w:color w:val="000000"/>
+                <w:sz w:val="20"/>
+              </w:rPr>
+              <w:t>Document Number:</w:t>
+            </w:r>
+          </w:p>
+        </w:tc>
+        <w:tc>
+          <w:tcPr>
+            <w:tcW w:type="dxa" w:w="2800"/>
+            <w:tcBorders>
+              <w:top w:val="single" w:sz="4" w:color="BFBFBF"/>
+              <w:left w:val="single" w:sz="4" w:color="BFBFBF"/>
+              <w:bottom w:val="single" w:sz="4" w:color="BFBFBF"/>
+              <w:right w:val="single" w:sz="4" w:color="BFBFBF"/>
+            </w:tcBorders>
+            <w:vAlign w:val="center"/>
+          </w:tcPr>
+          <w:p>
+            <w:r/>
+            <w:r>
+              <w:rPr>
+                <w:rFonts w:ascii="Arial" w:hAnsi="Arial" w:cs="Arial"/>
+                <w:b w:val="0"/>
+                <w:i w:val="0"/>
+                <w:color w:val="000000"/>
+                <w:sz w:val="20"/>
+              </w:rPr>
+              <w:t>{{ document_number }}</w:t>
+            </w:r>
+          </w:p>
+        </w:tc>
+        <w:tc>
+          <w:tcPr>
+            <w:tcW w:type="dxa" w:w="2000"/>
+            <w:shd w:val="clear" w:color="auto" w:fill="ECF0F1"/>
+            <w:tcBorders>
+              <w:top w:val="single" w:sz="4" w:color="BFBFBF"/>
+              <w:left w:val="single" w:sz="4" w:color="BFBFBF"/>
+              <w:bottom w:val="single" w:sz="4" w:color="BFBFBF"/>
+              <w:right w:val="single" w:sz="4" w:color="BFBFBF"/>
+            </w:tcBorders>
+            <w:vAlign w:val="center"/>
+          </w:tcPr>
+          <w:p>
+            <w:r/>
+            <w:r>
+              <w:rPr>
+                <w:rFonts w:ascii="Arial" w:hAnsi="Arial" w:cs="Arial"/>
+                <w:b/>
+                <w:i w:val="0"/>
+                <w:color w:val="000000"/>
+                <w:sz w:val="20"/>
+              </w:rPr>
+              <w:t>Revision:</w:t>
+            </w:r>
+          </w:p>
+        </w:tc>
+        <w:tc>
+          <w:tcPr>
+            <w:tcW w:type="dxa" w:w="2600"/>
+            <w:tcBorders>
+              <w:top w:val="single" w:sz="4" w:color="BFBFBF"/>
+              <w:left w:val="single" w:sz="4" w:color="BFBFBF"/>
+              <w:bottom w:val="single" w:sz="4" w:color="BFBFBF"/>
+              <w:right w:val="single" w:sz="4" w:color="BFBFBF"/>
+            </w:tcBorders>
+            <w:vAlign w:val="center"/>
+          </w:tcPr>
+          <w:p>
+            <w:r/>
+            <w:r>
+              <w:rPr>
+                <w:rFonts w:ascii="Arial" w:hAnsi="Arial" w:cs="Arial"/>
+                <w:b w:val="0"/>
+                <w:i w:val="0"/>
+                <w:color w:val="000000"/>
+                <w:sz w:val="20"/>
+              </w:rPr>
+              <w:t>{{ version_number }}</w:t>
+            </w:r>
+          </w:p>
+        </w:tc>
+      </w:tr>
+      <w:tr>
+        <w:tc>
+          <w:tcPr>
+            <w:tcW w:type="dxa" w:w="2400"/>
+            <w:shd w:val="clear" w:color="auto" w:fill="ECF0F1"/>
+            <w:tcBorders>
+              <w:top w:val="single" w:sz="4" w:color="BFBFBF"/>
+              <w:left w:val="single" w:sz="4" w:color="BFBFBF"/>
+              <w:bottom w:val="single" w:sz="4" w:color="BFBFBF"/>
+              <w:right w:val="single" w:sz="4" w:color="BFBFBF"/>
+            </w:tcBorders>
+            <w:vAlign w:val="center"/>
+          </w:tcPr>
+          <w:p>
+            <w:r/>
+            <w:r>
+              <w:rPr>
+                <w:rFonts w:ascii="Arial" w:hAnsi="Arial" w:cs="Arial"/>
+                <w:b/>
+                <w:i w:val="0"/>
+                <w:color w:val="000000"/>
+                <w:sz w:val="20"/>
+              </w:rPr>
+              <w:t>Title:</w:t>
+            </w:r>
+          </w:p>
+        </w:tc>
+        <w:tc>
+          <w:tcPr>
+            <w:tcW w:type="dxa" w:w="7400"/>
+            <w:gridSpan w:val="3"/>
+            <w:tcBorders>
+              <w:top w:val="single" w:sz="4" w:color="BFBFBF"/>
+              <w:left w:val="single" w:sz="4" w:color="BFBFBF"/>
+              <w:bottom w:val="single" w:sz="4" w:color="BFBFBF"/>
+              <w:right w:val="single" w:sz="4" w:color="BFBFBF"/>
+            </w:tcBorders>
+            <w:vAlign w:val="center"/>
+          </w:tcPr>
+          <w:p>
+            <w:r/>
+            <w:r>
+              <w:rPr>
+                <w:rFonts w:ascii="Arial" w:hAnsi="Arial" w:cs="Arial"/>
+                <w:b w:val="0"/>
+                <w:i w:val="0"/>
+                <w:color w:val="000000"/>
+                <w:sz w:val="20"/>
+              </w:rPr>
+              <w:t>{{ protocol_name }}</w:t>
+            </w:r>
+          </w:p>
+        </w:tc>
+      </w:tr>
+      <w:tr>
+        <w:tc>
+          <w:tcPr>
+            <w:tcW w:type="dxa" w:w="2400"/>
+            <w:shd w:val="clear" w:color="auto" w:fill="ECF0F1"/>
+            <w:tcBorders>
+              <w:top w:val="single" w:sz="4" w:color="BFBFBF"/>
+              <w:left w:val="single" w:sz="4" w:color="BFBFBF"/>
+              <w:bottom w:val="single" w:sz="4" w:color="BFBFBF"/>
+              <w:right w:val="single" w:sz="4" w:color="BFBFBF"/>
+            </w:tcBorders>
+            <w:vAlign w:val="center"/>
+          </w:tcPr>
+          <w:p>
+            <w:r/>
+            <w:r>
+              <w:rPr>
+                <w:rFonts w:ascii="Arial" w:hAnsi="Arial" w:cs="Arial"/>
+                <w:b/>
+                <w:i w:val="0"/>
+                <w:color w:val="000000"/>
+                <w:sz w:val="20"/>
+              </w:rPr>
+              <w:t>Effective Date:</w:t>
+            </w:r>
+          </w:p>
+        </w:tc>
+        <w:tc>
+          <w:tcPr>
+            <w:tcW w:type="dxa" w:w="7400"/>
+            <w:gridSpan w:val="3"/>
+            <w:tcBorders>
+              <w:top w:val="single" w:sz="4" w:color="BFBFBF"/>
+              <w:left w:val="single" w:sz="4" w:color="BFBFBF"/>
+              <w:bottom w:val="single" w:sz="4" w:color="BFBFBF"/>
+              <w:right w:val="single" w:sz="4" w:color="BFBFBF"/>
+            </w:tcBorders>
+            <w:vAlign w:val="center"/>
+          </w:tcPr>
+          <w:p>
+            <w:r/>
+            <w:r>
+              <w:rPr>
+                <w:rFonts w:ascii="Arial" w:hAnsi="Arial" w:cs="Arial"/>
+                <w:b w:val="0"/>
+                <w:i w:val="0"/>
+                <w:color w:val="000000"/>
+                <w:sz w:val="20"/>
+              </w:rPr>
+              <w:t>{{ effective_date }}</w:t>
+            </w:r>
+          </w:p>
+        </w:tc>
+      </w:tr>
+    </w:tbl>
+    <w:p>
+      <w:pPr>
+        <w:spacing w:after="80"/>
+      </w:pPr>
+    </w:p>
+    <w:p>
+      <w:pPr>
+        <w:spacing w:after="160"/>
+        <w:jc w:val="center"/>
+      </w:pPr>
+      <w:r>
+        <w:rPr>
+          <w:rFonts w:ascii="Arial" w:hAnsi="Arial" w:cs="Arial"/>
+          <w:b w:val="0"/>
+          <w:i w:val="0"/>
+          <w:color w:val="5F6368"/>
+          <w:sz w:val="18"/>
+        </w:rPr>
+        <w:t>{{ organization_name }}    Project: {{ project_name }}    Generated: {{ created_at }}</w:t>
       </w:r>
     </w:p>
     <w:p>
       <w:pPr>
-        <w:spacing w:before="0" w:after="80"/>
+        <w:keepNext/>
+        <w:spacing w:before="320" w:after="120"/>
+        <w:pBdr>
+          <w:bottom w:val="single" w:sz="8" w:space="4" w:color="D1D5DB"/>
+        </w:pBdr>
       </w:pPr>
       <w:r>
-        <w:t>{{r protocol_subtitle }}</w:t>
+        <w:rPr>
+          <w:rFonts w:ascii="Arial" w:hAnsi="Arial" w:cs="Arial"/>
+          <w:b/>
+          <w:i w:val="0"/>
+          <w:color w:val="1F3A5F"/>
+          <w:sz w:val="32"/>
+        </w:rPr>
+        <w:t>1.0 Purpose</w:t>
       </w:r>
     </w:p>
     <w:p>
       <w:pPr>
-        <w:spacing w:after="120" w:before="0"/>
+        <w:spacing w:after="160"/>
       </w:pPr>
       <w:r>
         <w:rPr>
+          <w:rFonts w:ascii="Arial" w:hAnsi="Arial" w:cs="Arial"/>
           <w:b w:val="0"/>
           <w:i w:val="0"/>
-          <w:color w:val="C8C8C8"/>
-          <w:sz w:val="12"/>
+          <w:color w:val="000000"/>
+          <w:sz w:val="20"/>
         </w:rPr>
-        <w:t>──────────────────────────────────────────────────</w:t>
+        <w:t>{{ purpose_text }}</w:t>
       </w:r>
     </w:p>
     <w:p>
       <w:pPr>
-        <w:spacing w:after="0"/>
+        <w:keepNext/>
+        <w:spacing w:before="320" w:after="120"/>
+        <w:pBdr>
+          <w:bottom w:val="single" w:sz="8" w:space="4" w:color="D1D5DB"/>
+        </w:pBdr>
       </w:pPr>
       <w:r>
         <w:rPr>
+          <w:rFonts w:ascii="Arial" w:hAnsi="Arial" w:cs="Arial"/>
+          <w:b/>
+          <w:i w:val="0"/>
+          <w:color w:val="1F3A5F"/>
+          <w:sz w:val="32"/>
+        </w:rPr>
+        <w:t>2.0 Scope</w:t>
+      </w:r>
+    </w:p>
+    <w:p>
+      <w:pPr>
+        <w:spacing w:after="160"/>
+      </w:pPr>
+      <w:r>
+        <w:rPr>
+          <w:rFonts w:ascii="Arial" w:hAnsi="Arial" w:cs="Arial"/>
           <w:b w:val="0"/>
           <w:i w:val="0"/>
-          <w:color w:val="334155"/>
-          <w:sz w:val="2"/>
+          <w:color w:val="000000"/>
+          <w:sz w:val="20"/>
+        </w:rPr>
+        <w:t>{{ scope_text }}</w:t>
+      </w:r>
+    </w:p>
+    <w:p>
+      <w:pPr>
+        <w:keepNext/>
+        <w:spacing w:before="320" w:after="120"/>
+        <w:pBdr>
+          <w:bottom w:val="single" w:sz="8" w:space="4" w:color="D1D5DB"/>
+        </w:pBdr>
+      </w:pPr>
+      <w:r>
+        <w:rPr>
+          <w:rFonts w:ascii="Arial" w:hAnsi="Arial" w:cs="Arial"/>
+          <w:b/>
+          <w:i w:val="0"/>
+          <w:color w:val="1F3A5F"/>
+          <w:sz w:val="32"/>
+        </w:rPr>
+        <w:t>3.0 Procedure: {{ protocol_name }}</w:t>
+      </w:r>
+    </w:p>
+    <w:p>
+      <w:pPr>
+        <w:spacing w:before="0" w:after="0"/>
+      </w:pPr>
+      <w:r>
+        <w:rPr>
+          <w:rFonts w:ascii="Arial" w:hAnsi="Arial" w:cs="Arial"/>
+          <w:b w:val="0"/>
+          <w:i w:val="0"/>
+          <w:color w:val="5F6368"/>
+          <w:sz w:val="16"/>
+        </w:rPr>
+        <w:t>{%p if critical_requirement %}</w:t>
+      </w:r>
+    </w:p>
+    <w:p>
+      <w:pPr>
+        <w:spacing w:before="80" w:after="200"/>
+      </w:pPr>
+      <w:r>
+        <w:rPr>
+          <w:rFonts w:ascii="Arial" w:hAnsi="Arial" w:cs="Arial"/>
+          <w:b/>
+          <w:i w:val="0"/>
+          <w:color w:val="B91C1C"/>
+          <w:sz w:val="20"/>
+        </w:rPr>
+        <w:t xml:space="preserve">CRITICAL REQUIREMENT: </w:t>
+      </w:r>
+      <w:r>
+        <w:rPr>
+          <w:rFonts w:ascii="Arial" w:hAnsi="Arial" w:cs="Arial"/>
+          <w:b w:val="0"/>
+          <w:i w:val="0"/>
+          <w:color w:val="000000"/>
+          <w:sz w:val="20"/>
+        </w:rPr>
+        <w:t>{{ critical_requirement }}</w:t>
+      </w:r>
+    </w:p>
+    <w:p>
+      <w:pPr>
+        <w:spacing w:before="0" w:after="0"/>
+      </w:pPr>
+      <w:r>
+        <w:rPr>
+          <w:rFonts w:ascii="Arial" w:hAnsi="Arial" w:cs="Arial"/>
+          <w:b w:val="0"/>
+          <w:i w:val="0"/>
+          <w:color w:val="5F6368"/>
+          <w:sz w:val="16"/>
+        </w:rPr>
+        <w:t>{%p endif %}</w:t>
+      </w:r>
+    </w:p>
+    <w:p>
+      <w:pPr>
+        <w:spacing w:before="0" w:after="0"/>
+      </w:pPr>
+      <w:r>
+        <w:rPr>
+          <w:rFonts w:ascii="Arial" w:hAnsi="Arial" w:cs="Arial"/>
+          <w:b w:val="0"/>
+          <w:i w:val="0"/>
+          <w:color w:val="5F6368"/>
+          <w:sz w:val="16"/>
+        </w:rPr>
+        <w:t>{%p if is_time_based %}</w:t>
+      </w:r>
+    </w:p>
+    <w:p>
+      <w:pPr>
+        <w:spacing w:before="0" w:after="0"/>
+      </w:pPr>
+      <w:r>
+        <w:rPr>
+          <w:rFonts w:ascii="Arial" w:hAnsi="Arial" w:cs="Arial"/>
+          <w:b w:val="0"/>
+          <w:i w:val="0"/>
+          <w:color w:val="5F6368"/>
+          <w:sz w:val="16"/>
+        </w:rPr>
+        <w:t>{%p for tp in time_points %}</w:t>
+      </w:r>
+    </w:p>
+    <w:p>
+      <w:pPr>
+        <w:keepNext/>
+        <w:spacing w:before="280" w:after="80"/>
+      </w:pPr>
+      <w:r>
+        <w:rPr>
+          <w:rFonts w:ascii="Arial" w:hAnsi="Arial" w:cs="Arial"/>
+          <w:b/>
+          <w:i w:val="0"/>
+          <w:color w:val="1F3A5F"/>
+          <w:sz w:val="26"/>
+        </w:rPr>
+        <w:t>3.{{ loop.index }}  {{ tp.name }}</w:t>
+      </w:r>
+    </w:p>
+    <w:p>
+      <w:pPr>
+        <w:spacing w:before="0" w:after="0"/>
+      </w:pPr>
+      <w:r>
+        <w:rPr>
+          <w:rFonts w:ascii="Arial" w:hAnsi="Arial" w:cs="Arial"/>
+          <w:b w:val="0"/>
+          <w:i w:val="0"/>
+          <w:color w:val="5F6368"/>
+          <w:sz w:val="16"/>
+        </w:rPr>
+        <w:t>{%p if tp.preamble %}</w:t>
+      </w:r>
+    </w:p>
+    <w:p>
+      <w:pPr>
+        <w:spacing w:after="120"/>
+      </w:pPr>
+      <w:r>
+        <w:rPr>
+          <w:rFonts w:ascii="Arial" w:hAnsi="Arial" w:cs="Arial"/>
+          <w:b w:val="0"/>
+          <w:i w:val="0"/>
+          <w:color w:val="000000"/>
+          <w:sz w:val="20"/>
+        </w:rPr>
+        <w:t>{{ tp.preamble }}</w:t>
+      </w:r>
+    </w:p>
+    <w:p>
+      <w:pPr>
+        <w:spacing w:before="0" w:after="0"/>
+      </w:pPr>
+      <w:r>
+        <w:rPr>
+          <w:rFonts w:ascii="Arial" w:hAnsi="Arial" w:cs="Arial"/>
+          <w:b w:val="0"/>
+          <w:i w:val="0"/>
+          <w:color w:val="5F6368"/>
+          <w:sz w:val="16"/>
+        </w:rPr>
+        <w:t>{%p endif %}</w:t>
+      </w:r>
+    </w:p>
+    <w:p>
+      <w:pPr>
+        <w:spacing w:before="0" w:after="0"/>
+      </w:pPr>
+      <w:r>
+        <w:rPr>
+          <w:rFonts w:ascii="Arial" w:hAnsi="Arial" w:cs="Arial"/>
+          <w:b w:val="0"/>
+          <w:i w:val="0"/>
+          <w:color w:val="5F6368"/>
+          <w:sz w:val="16"/>
+        </w:rPr>
+        <w:t>{%p if tp.figure %}</w:t>
+      </w:r>
+    </w:p>
+    <w:tbl>
+      <w:tblPr>
+        <w:tblW w:type="auto" w:w="0"/>
+        <w:tblLook w:firstColumn="1" w:firstRow="1" w:lastColumn="0" w:lastRow="0" w:noHBand="0" w:noVBand="1" w:val="04A0"/>
+        <w:tblLayout w:type="fixed"/>
+      </w:tblPr>
+      <w:tblGrid>
+        <w:gridCol w:w="10080"/>
+      </w:tblGrid>
+      <w:tr>
+        <w:tc>
+          <w:tcPr>
+            <w:tcW w:type="dxa" w:w="9800"/>
+            <w:shd w:val="clear" w:color="auto" w:fill="FDFDFD"/>
+            <w:tcBorders>
+              <w:top w:val="single" w:sz="4" w:color="BFBFBF"/>
+              <w:left w:val="single" w:sz="4" w:color="BFBFBF"/>
+              <w:bottom w:val="single" w:sz="4" w:color="BFBFBF"/>
+              <w:right w:val="single" w:sz="4" w:color="BFBFBF"/>
+            </w:tcBorders>
+            <w:vAlign w:val="center"/>
+          </w:tcPr>
+          <w:p>
+            <w:pPr>
+              <w:spacing w:before="160" w:after="80"/>
+              <w:jc w:val="center"/>
+            </w:pPr>
+            <w:r/>
+            <w:r>
+              <w:rPr>
+                <w:rFonts w:ascii="Arial" w:hAnsi="Arial" w:cs="Arial"/>
+                <w:b w:val="0"/>
+                <w:i w:val="0"/>
+                <w:color w:val="000000"/>
+                <w:sz w:val="20"/>
+              </w:rPr>
+              <w:t>{{ tp.figure.image }}</w:t>
+            </w:r>
+          </w:p>
+          <w:p>
+            <w:pPr>
+              <w:spacing w:after="80"/>
+              <w:jc w:val="center"/>
+            </w:pPr>
+            <w:r>
+              <w:rPr>
+                <w:rFonts w:ascii="Arial" w:hAnsi="Arial" w:cs="Arial"/>
+                <w:b/>
+                <w:i w:val="0"/>
+                <w:color w:val="5F6368"/>
+                <w:sz w:val="22"/>
+              </w:rPr>
+              <w:t>{{ tp.figure.caption }}</w:t>
+            </w:r>
+          </w:p>
+          <w:p>
+            <w:pPr>
+              <w:spacing w:after="160"/>
+              <w:jc w:val="center"/>
+            </w:pPr>
+            <w:r>
+              <w:rPr>
+                <w:rFonts w:ascii="Arial" w:hAnsi="Arial" w:cs="Arial"/>
+                <w:b w:val="0"/>
+                <w:i/>
+                <w:color w:val="5F6368"/>
+                <w:sz w:val="20"/>
+              </w:rPr>
+              <w:t>{{ tp.figure.description }}</w:t>
+            </w:r>
+          </w:p>
+        </w:tc>
+      </w:tr>
+    </w:tbl>
+    <w:p>
+      <w:pPr>
+        <w:spacing w:after="80"/>
+      </w:pPr>
+    </w:p>
+    <w:p>
+      <w:pPr>
+        <w:spacing w:before="0" w:after="0"/>
+      </w:pPr>
+      <w:r>
+        <w:rPr>
+          <w:rFonts w:ascii="Arial" w:hAnsi="Arial" w:cs="Arial"/>
+          <w:b w:val="0"/>
+          <w:i w:val="0"/>
+          <w:color w:val="5F6368"/>
+          <w:sz w:val="16"/>
+        </w:rPr>
+        <w:t>{%p endif %}</w:t>
+      </w:r>
+    </w:p>
+    <w:tbl>
+      <w:tblPr>
+        <w:tblW w:type="auto" w:w="0"/>
+        <w:tblLook w:firstColumn="1" w:firstRow="1" w:lastColumn="0" w:lastRow="0" w:noHBand="0" w:noVBand="1" w:val="04A0"/>
+        <w:tblLayout w:type="fixed"/>
+      </w:tblPr>
+      <w:tblGrid>
+        <w:gridCol w:w="3360"/>
+        <w:gridCol w:w="3360"/>
+        <w:gridCol w:w="3360"/>
+      </w:tblGrid>
+      <w:tr>
+        <w:tc>
+          <w:tcPr>
+            <w:tcW w:type="dxa" w:w="2200"/>
+            <w:shd w:val="clear" w:color="auto" w:fill="ECF0F1"/>
+            <w:tcBorders>
+              <w:top w:val="single" w:sz="4" w:color="BFBFBF"/>
+              <w:left w:val="single" w:sz="4" w:color="BFBFBF"/>
+              <w:bottom w:val="single" w:sz="4" w:color="BFBFBF"/>
+              <w:right w:val="single" w:sz="4" w:color="BFBFBF"/>
+            </w:tcBorders>
+            <w:vAlign w:val="center"/>
+          </w:tcPr>
+          <w:p>
+            <w:pPr>
+              <w:jc w:val="center"/>
+            </w:pPr>
+            <w:r/>
+            <w:r>
+              <w:rPr>
+                <w:rFonts w:ascii="Arial" w:hAnsi="Arial" w:cs="Arial"/>
+                <w:b/>
+                <w:i w:val="0"/>
+                <w:color w:val="000000"/>
+                <w:sz w:val="20"/>
+              </w:rPr>
+              <w:t>Time Target</w:t>
+            </w:r>
+          </w:p>
+        </w:tc>
+        <w:tc>
+          <w:tcPr>
+            <w:tcW w:type="dxa" w:w="4800"/>
+            <w:shd w:val="clear" w:color="auto" w:fill="ECF0F1"/>
+            <w:tcBorders>
+              <w:top w:val="single" w:sz="4" w:color="BFBFBF"/>
+              <w:left w:val="single" w:sz="4" w:color="BFBFBF"/>
+              <w:bottom w:val="single" w:sz="4" w:color="BFBFBF"/>
+              <w:right w:val="single" w:sz="4" w:color="BFBFBF"/>
+            </w:tcBorders>
+            <w:vAlign w:val="center"/>
+          </w:tcPr>
+          <w:p>
+            <w:pPr>
+              <w:jc w:val="center"/>
+            </w:pPr>
+            <w:r/>
+            <w:r>
+              <w:rPr>
+                <w:rFonts w:ascii="Arial" w:hAnsi="Arial" w:cs="Arial"/>
+                <w:b/>
+                <w:i w:val="0"/>
+                <w:color w:val="000000"/>
+                <w:sz w:val="20"/>
+              </w:rPr>
+              <w:t>Action</w:t>
+            </w:r>
+          </w:p>
+        </w:tc>
+        <w:tc>
+          <w:tcPr>
+            <w:tcW w:type="dxa" w:w="2800"/>
+            <w:shd w:val="clear" w:color="auto" w:fill="ECF0F1"/>
+            <w:tcBorders>
+              <w:top w:val="single" w:sz="4" w:color="BFBFBF"/>
+              <w:left w:val="single" w:sz="4" w:color="BFBFBF"/>
+              <w:bottom w:val="single" w:sz="4" w:color="BFBFBF"/>
+              <w:right w:val="single" w:sz="4" w:color="BFBFBF"/>
+            </w:tcBorders>
+            <w:vAlign w:val="center"/>
+          </w:tcPr>
+          <w:p>
+            <w:pPr>
+              <w:jc w:val="center"/>
+            </w:pPr>
+            <w:r/>
+            <w:r>
+              <w:rPr>
+                <w:rFonts w:ascii="Arial" w:hAnsi="Arial" w:cs="Arial"/>
+                <w:b/>
+                <w:i w:val="0"/>
+                <w:color w:val="000000"/>
+                <w:sz w:val="20"/>
+              </w:rPr>
+              <w:t>Expected Output / Log</w:t>
+            </w:r>
+          </w:p>
+        </w:tc>
+      </w:tr>
+      <w:tr>
+        <w:tc>
+          <w:tcPr>
+            <w:tcW w:type="dxa" w:w="2200"/>
+            <w:tcBorders>
+              <w:top w:val="single" w:sz="4" w:color="BFBFBF"/>
+              <w:left w:val="single" w:sz="4" w:color="BFBFBF"/>
+              <w:bottom w:val="single" w:sz="4" w:color="BFBFBF"/>
+              <w:right w:val="single" w:sz="4" w:color="BFBFBF"/>
+            </w:tcBorders>
+            <w:vAlign w:val="center"/>
+          </w:tcPr>
+          <w:p>
+            <w:r/>
+            <w:r>
+              <w:rPr>
+                <w:rFonts w:ascii="Arial" w:hAnsi="Arial" w:cs="Arial"/>
+                <w:b w:val="0"/>
+                <w:i w:val="0"/>
+                <w:color w:val="5F6368"/>
+                <w:sz w:val="16"/>
+              </w:rPr>
+              <w:t>{%tr for act in tp.actions %}</w:t>
+            </w:r>
+          </w:p>
+        </w:tc>
+        <w:tc>
+          <w:tcPr>
+            <w:tcW w:type="dxa" w:w="4800"/>
+            <w:tcBorders>
+              <w:top w:val="single" w:sz="4" w:color="BFBFBF"/>
+              <w:left w:val="single" w:sz="4" w:color="BFBFBF"/>
+              <w:bottom w:val="single" w:sz="4" w:color="BFBFBF"/>
+              <w:right w:val="single" w:sz="4" w:color="BFBFBF"/>
+            </w:tcBorders>
+            <w:vAlign w:val="center"/>
+          </w:tcPr>
+          <w:p>
+            <w:r/>
+            <w:r>
+              <w:rPr>
+                <w:rFonts w:ascii="Arial" w:hAnsi="Arial" w:cs="Arial"/>
+                <w:b w:val="0"/>
+                <w:i w:val="0"/>
+                <w:color w:val="000000"/>
+                <w:sz w:val="20"/>
+              </w:rPr>
+            </w:r>
+          </w:p>
+        </w:tc>
+        <w:tc>
+          <w:tcPr>
+            <w:tcW w:type="dxa" w:w="2800"/>
+            <w:tcBorders>
+              <w:top w:val="single" w:sz="4" w:color="BFBFBF"/>
+              <w:left w:val="single" w:sz="4" w:color="BFBFBF"/>
+              <w:bottom w:val="single" w:sz="4" w:color="BFBFBF"/>
+              <w:right w:val="single" w:sz="4" w:color="BFBFBF"/>
+            </w:tcBorders>
+            <w:vAlign w:val="center"/>
+          </w:tcPr>
+          <w:p>
+            <w:r/>
+            <w:r>
+              <w:rPr>
+                <w:rFonts w:ascii="Arial" w:hAnsi="Arial" w:cs="Arial"/>
+                <w:b w:val="0"/>
+                <w:i w:val="0"/>
+                <w:color w:val="000000"/>
+                <w:sz w:val="20"/>
+              </w:rPr>
+            </w:r>
+          </w:p>
+        </w:tc>
+      </w:tr>
+      <w:tr>
+        <w:tc>
+          <w:tcPr>
+            <w:tcW w:type="dxa" w:w="2200"/>
+            <w:tcBorders>
+              <w:top w:val="single" w:sz="4" w:color="BFBFBF"/>
+              <w:left w:val="single" w:sz="4" w:color="BFBFBF"/>
+              <w:bottom w:val="single" w:sz="4" w:color="BFBFBF"/>
+              <w:right w:val="single" w:sz="4" w:color="BFBFBF"/>
+            </w:tcBorders>
+            <w:vAlign w:val="center"/>
+          </w:tcPr>
+          <w:p>
+            <w:pPr>
+              <w:jc w:val="center"/>
+            </w:pPr>
+            <w:r/>
+            <w:r>
+              <w:rPr>
+                <w:rFonts w:ascii="Arial" w:hAnsi="Arial" w:cs="Arial"/>
+                <w:b/>
+                <w:i w:val="0"/>
+                <w:color w:val="000000"/>
+                <w:sz w:val="20"/>
+              </w:rPr>
+              <w:t>{{ act.time }}</w:t>
+            </w:r>
+          </w:p>
+        </w:tc>
+        <w:tc>
+          <w:tcPr>
+            <w:tcW w:type="dxa" w:w="4800"/>
+            <w:tcBorders>
+              <w:top w:val="single" w:sz="4" w:color="BFBFBF"/>
+              <w:left w:val="single" w:sz="4" w:color="BFBFBF"/>
+              <w:bottom w:val="single" w:sz="4" w:color="BFBFBF"/>
+              <w:right w:val="single" w:sz="4" w:color="BFBFBF"/>
+            </w:tcBorders>
+            <w:vAlign w:val="center"/>
+          </w:tcPr>
+          <w:p>
+            <w:r/>
+            <w:r>
+              <w:rPr>
+                <w:rFonts w:ascii="Arial" w:hAnsi="Arial" w:cs="Arial"/>
+                <w:b w:val="0"/>
+                <w:i w:val="0"/>
+                <w:color w:val="000000"/>
+                <w:sz w:val="20"/>
+              </w:rPr>
+              <w:t>{{ act.action }}</w:t>
+            </w:r>
+          </w:p>
+        </w:tc>
+        <w:tc>
+          <w:tcPr>
+            <w:tcW w:type="dxa" w:w="2800"/>
+            <w:tcBorders>
+              <w:top w:val="single" w:sz="4" w:color="BFBFBF"/>
+              <w:left w:val="single" w:sz="4" w:color="BFBFBF"/>
+              <w:bottom w:val="single" w:sz="4" w:color="BFBFBF"/>
+              <w:right w:val="single" w:sz="4" w:color="BFBFBF"/>
+            </w:tcBorders>
+            <w:vAlign w:val="center"/>
+          </w:tcPr>
+          <w:p>
+            <w:pPr>
+              <w:jc w:val="center"/>
+            </w:pPr>
+            <w:r/>
+            <w:r>
+              <w:rPr>
+                <w:rFonts w:ascii="Arial" w:hAnsi="Arial" w:cs="Arial"/>
+                <w:b w:val="0"/>
+                <w:i w:val="0"/>
+                <w:color w:val="000000"/>
+                <w:sz w:val="20"/>
+              </w:rPr>
+              <w:t>{{ act.output }}</w:t>
+            </w:r>
+          </w:p>
+        </w:tc>
+      </w:tr>
+      <w:tr>
+        <w:tc>
+          <w:tcPr>
+            <w:tcW w:type="dxa" w:w="2200"/>
+            <w:tcBorders>
+              <w:top w:val="single" w:sz="4" w:color="BFBFBF"/>
+              <w:left w:val="single" w:sz="4" w:color="BFBFBF"/>
+              <w:bottom w:val="single" w:sz="4" w:color="BFBFBF"/>
+              <w:right w:val="single" w:sz="4" w:color="BFBFBF"/>
+            </w:tcBorders>
+            <w:vAlign w:val="center"/>
+          </w:tcPr>
+          <w:p>
+            <w:r/>
+            <w:r>
+              <w:rPr>
+                <w:rFonts w:ascii="Arial" w:hAnsi="Arial" w:cs="Arial"/>
+                <w:b w:val="0"/>
+                <w:i w:val="0"/>
+                <w:color w:val="5F6368"/>
+                <w:sz w:val="16"/>
+              </w:rPr>
+              <w:t>{%tr endfor %}</w:t>
+            </w:r>
+          </w:p>
+        </w:tc>
+        <w:tc>
+          <w:tcPr>
+            <w:tcW w:type="dxa" w:w="4800"/>
+            <w:tcBorders>
+              <w:top w:val="single" w:sz="4" w:color="BFBFBF"/>
+              <w:left w:val="single" w:sz="4" w:color="BFBFBF"/>
+              <w:bottom w:val="single" w:sz="4" w:color="BFBFBF"/>
+              <w:right w:val="single" w:sz="4" w:color="BFBFBF"/>
+            </w:tcBorders>
+            <w:vAlign w:val="center"/>
+          </w:tcPr>
+          <w:p>
+            <w:r/>
+            <w:r>
+              <w:rPr>
+                <w:rFonts w:ascii="Arial" w:hAnsi="Arial" w:cs="Arial"/>
+                <w:b w:val="0"/>
+                <w:i w:val="0"/>
+                <w:color w:val="000000"/>
+                <w:sz w:val="20"/>
+              </w:rPr>
+            </w:r>
+          </w:p>
+        </w:tc>
+        <w:tc>
+          <w:tcPr>
+            <w:tcW w:type="dxa" w:w="2800"/>
+            <w:tcBorders>
+              <w:top w:val="single" w:sz="4" w:color="BFBFBF"/>
+              <w:left w:val="single" w:sz="4" w:color="BFBFBF"/>
+              <w:bottom w:val="single" w:sz="4" w:color="BFBFBF"/>
+              <w:right w:val="single" w:sz="4" w:color="BFBFBF"/>
+            </w:tcBorders>
+            <w:vAlign w:val="center"/>
+          </w:tcPr>
+          <w:p>
+            <w:r/>
+            <w:r>
+              <w:rPr>
+                <w:rFonts w:ascii="Arial" w:hAnsi="Arial" w:cs="Arial"/>
+                <w:b w:val="0"/>
+                <w:i w:val="0"/>
+                <w:color w:val="000000"/>
+                <w:sz w:val="20"/>
+              </w:rPr>
+            </w:r>
+          </w:p>
+        </w:tc>
+      </w:tr>
+    </w:tbl>
+    <w:p>
+      <w:pPr>
+        <w:spacing w:before="0" w:after="0"/>
+      </w:pPr>
+      <w:r>
+        <w:rPr>
+          <w:rFonts w:ascii="Arial" w:hAnsi="Arial" w:cs="Arial"/>
+          <w:b w:val="0"/>
+          <w:i w:val="0"/>
+          <w:color w:val="5F6368"/>
+          <w:sz w:val="16"/>
+        </w:rPr>
+        <w:t>{%p endfor %}</w:t>
+      </w:r>
+    </w:p>
+    <w:p>
+      <w:pPr>
+        <w:spacing w:before="0" w:after="0"/>
+      </w:pPr>
+      <w:r>
+        <w:rPr>
+          <w:rFonts w:ascii="Arial" w:hAnsi="Arial" w:cs="Arial"/>
+          <w:b w:val="0"/>
+          <w:i w:val="0"/>
+          <w:color w:val="5F6368"/>
+          <w:sz w:val="16"/>
+        </w:rPr>
+        <w:t>{%p else %}</w:t>
+      </w:r>
+    </w:p>
+    <w:p>
+      <w:pPr>
+        <w:spacing w:before="0" w:after="0"/>
+      </w:pPr>
+      <w:r>
+        <w:rPr>
+          <w:rFonts w:ascii="Arial" w:hAnsi="Arial" w:cs="Arial"/>
+          <w:b w:val="0"/>
+          <w:i w:val="0"/>
+          <w:color w:val="5F6368"/>
+          <w:sz w:val="16"/>
+        </w:rPr>
+        <w:t>{%p if is_role_based and roles|length &gt; 1 %}</w:t>
+      </w:r>
+    </w:p>
+    <w:p>
+      <w:pPr>
+        <w:spacing w:before="0" w:after="0"/>
+      </w:pPr>
+      <w:r>
+        <w:rPr>
+          <w:rFonts w:ascii="Arial" w:hAnsi="Arial" w:cs="Arial"/>
+          <w:b w:val="0"/>
+          <w:i w:val="0"/>
+          <w:color w:val="5F6368"/>
+          <w:sz w:val="16"/>
         </w:rPr>
         <w:t>{%p for role in roles %}</w:t>
       </w:r>
     </w:p>
     <w:p>
       <w:pPr>
-        <w:spacing w:before="0" w:after="80"/>
-      </w:pPr>
-      <w:r>
-        <w:t>{{r role.sop_header }}</w:t>
-      </w:r>
-    </w:p>
-    <w:p>
-      <w:pPr>
-        <w:spacing w:after="0"/>
+        <w:keepNext/>
+        <w:spacing w:before="280" w:after="80"/>
       </w:pPr>
       <w:r>
         <w:rPr>
-          <w:b w:val="0"/>
+          <w:rFonts w:ascii="Arial" w:hAnsi="Arial" w:cs="Arial"/>
+          <w:b/>
           <w:i w:val="0"/>
-          <w:color w:val="334155"/>
-          <w:sz w:val="2"/>
+          <w:color w:val="1F3A5F"/>
+          <w:sz w:val="26"/>
         </w:rPr>
-        <w:t>{%p for step in role.sop_steps %}</w:t>
+        <w:t>3.{{ loop.index }}  {{ role.process_name or role.name }}</w:t>
       </w:r>
     </w:p>
+    <w:tbl>
+      <w:tblPr>
+        <w:tblW w:type="auto" w:w="0"/>
+        <w:tblLook w:firstColumn="1" w:firstRow="1" w:lastColumn="0" w:lastRow="0" w:noHBand="0" w:noVBand="1" w:val="04A0"/>
+        <w:tblLayout w:type="fixed"/>
+      </w:tblPr>
+      <w:tblGrid>
+        <w:gridCol w:w="2520"/>
+        <w:gridCol w:w="2520"/>
+        <w:gridCol w:w="2520"/>
+        <w:gridCol w:w="2520"/>
+      </w:tblGrid>
+      <w:tr>
+        <w:tc>
+          <w:tcPr>
+            <w:tcW w:type="dxa" w:w="800"/>
+            <w:shd w:val="clear" w:color="auto" w:fill="ECF0F1"/>
+            <w:tcBorders>
+              <w:top w:val="single" w:sz="4" w:color="BFBFBF"/>
+              <w:left w:val="single" w:sz="4" w:color="BFBFBF"/>
+              <w:bottom w:val="single" w:sz="4" w:color="BFBFBF"/>
+              <w:right w:val="single" w:sz="4" w:color="BFBFBF"/>
+            </w:tcBorders>
+            <w:vAlign w:val="center"/>
+          </w:tcPr>
+          <w:p>
+            <w:pPr>
+              <w:jc w:val="center"/>
+            </w:pPr>
+            <w:r/>
+            <w:r>
+              <w:rPr>
+                <w:rFonts w:ascii="Arial" w:hAnsi="Arial" w:cs="Arial"/>
+                <w:b/>
+                <w:i w:val="0"/>
+                <w:color w:val="000000"/>
+                <w:sz w:val="20"/>
+              </w:rPr>
+              <w:t>Step</w:t>
+            </w:r>
+          </w:p>
+        </w:tc>
+        <w:tc>
+          <w:tcPr>
+            <w:tcW w:type="dxa" w:w="2600"/>
+            <w:shd w:val="clear" w:color="auto" w:fill="ECF0F1"/>
+            <w:tcBorders>
+              <w:top w:val="single" w:sz="4" w:color="BFBFBF"/>
+              <w:left w:val="single" w:sz="4" w:color="BFBFBF"/>
+              <w:bottom w:val="single" w:sz="4" w:color="BFBFBF"/>
+              <w:right w:val="single" w:sz="4" w:color="BFBFBF"/>
+            </w:tcBorders>
+            <w:vAlign w:val="center"/>
+          </w:tcPr>
+          <w:p>
+            <w:pPr>
+              <w:jc w:val="center"/>
+            </w:pPr>
+            <w:r/>
+            <w:r>
+              <w:rPr>
+                <w:rFonts w:ascii="Arial" w:hAnsi="Arial" w:cs="Arial"/>
+                <w:b/>
+                <w:i w:val="0"/>
+                <w:color w:val="000000"/>
+                <w:sz w:val="20"/>
+              </w:rPr>
+              <w:t>Name</w:t>
+            </w:r>
+          </w:p>
+        </w:tc>
+        <w:tc>
+          <w:tcPr>
+            <w:tcW w:type="dxa" w:w="4800"/>
+            <w:shd w:val="clear" w:color="auto" w:fill="ECF0F1"/>
+            <w:tcBorders>
+              <w:top w:val="single" w:sz="4" w:color="BFBFBF"/>
+              <w:left w:val="single" w:sz="4" w:color="BFBFBF"/>
+              <w:bottom w:val="single" w:sz="4" w:color="BFBFBF"/>
+              <w:right w:val="single" w:sz="4" w:color="BFBFBF"/>
+            </w:tcBorders>
+            <w:vAlign w:val="center"/>
+          </w:tcPr>
+          <w:p>
+            <w:pPr>
+              <w:jc w:val="center"/>
+            </w:pPr>
+            <w:r/>
+            <w:r>
+              <w:rPr>
+                <w:rFonts w:ascii="Arial" w:hAnsi="Arial" w:cs="Arial"/>
+                <w:b/>
+                <w:i w:val="0"/>
+                <w:color w:val="000000"/>
+                <w:sz w:val="20"/>
+              </w:rPr>
+              <w:t>Instruction</w:t>
+            </w:r>
+          </w:p>
+        </w:tc>
+        <w:tc>
+          <w:tcPr>
+            <w:tcW w:type="dxa" w:w="1600"/>
+            <w:shd w:val="clear" w:color="auto" w:fill="ECF0F1"/>
+            <w:tcBorders>
+              <w:top w:val="single" w:sz="4" w:color="BFBFBF"/>
+              <w:left w:val="single" w:sz="4" w:color="BFBFBF"/>
+              <w:bottom w:val="single" w:sz="4" w:color="BFBFBF"/>
+              <w:right w:val="single" w:sz="4" w:color="BFBFBF"/>
+            </w:tcBorders>
+            <w:vAlign w:val="center"/>
+          </w:tcPr>
+          <w:p>
+            <w:pPr>
+              <w:jc w:val="center"/>
+            </w:pPr>
+            <w:r/>
+            <w:r>
+              <w:rPr>
+                <w:rFonts w:ascii="Arial" w:hAnsi="Arial" w:cs="Arial"/>
+                <w:b/>
+                <w:i w:val="0"/>
+                <w:color w:val="000000"/>
+                <w:sz w:val="20"/>
+              </w:rPr>
+              <w:t>Duration</w:t>
+            </w:r>
+          </w:p>
+        </w:tc>
+      </w:tr>
+      <w:tr>
+        <w:tc>
+          <w:tcPr>
+            <w:tcW w:type="dxa" w:w="800"/>
+            <w:tcBorders>
+              <w:top w:val="single" w:sz="4" w:color="BFBFBF"/>
+              <w:left w:val="single" w:sz="4" w:color="BFBFBF"/>
+              <w:bottom w:val="single" w:sz="4" w:color="BFBFBF"/>
+              <w:right w:val="single" w:sz="4" w:color="BFBFBF"/>
+            </w:tcBorders>
+            <w:vAlign w:val="center"/>
+          </w:tcPr>
+          <w:p>
+            <w:r/>
+            <w:r>
+              <w:rPr>
+                <w:rFonts w:ascii="Arial" w:hAnsi="Arial" w:cs="Arial"/>
+                <w:b w:val="0"/>
+                <w:i w:val="0"/>
+                <w:color w:val="5F6368"/>
+                <w:sz w:val="16"/>
+              </w:rPr>
+              <w:t>{%tr for step in role.steps %}</w:t>
+            </w:r>
+          </w:p>
+        </w:tc>
+        <w:tc>
+          <w:tcPr>
+            <w:tcW w:type="dxa" w:w="2600"/>
+            <w:tcBorders>
+              <w:top w:val="single" w:sz="4" w:color="BFBFBF"/>
+              <w:left w:val="single" w:sz="4" w:color="BFBFBF"/>
+              <w:bottom w:val="single" w:sz="4" w:color="BFBFBF"/>
+              <w:right w:val="single" w:sz="4" w:color="BFBFBF"/>
+            </w:tcBorders>
+            <w:vAlign w:val="center"/>
+          </w:tcPr>
+          <w:p>
+            <w:r/>
+            <w:r>
+              <w:rPr>
+                <w:rFonts w:ascii="Arial" w:hAnsi="Arial" w:cs="Arial"/>
+                <w:b w:val="0"/>
+                <w:i w:val="0"/>
+                <w:color w:val="000000"/>
+                <w:sz w:val="20"/>
+              </w:rPr>
+            </w:r>
+          </w:p>
+        </w:tc>
+        <w:tc>
+          <w:tcPr>
+            <w:tcW w:type="dxa" w:w="4800"/>
+            <w:tcBorders>
+              <w:top w:val="single" w:sz="4" w:color="BFBFBF"/>
+              <w:left w:val="single" w:sz="4" w:color="BFBFBF"/>
+              <w:bottom w:val="single" w:sz="4" w:color="BFBFBF"/>
+              <w:right w:val="single" w:sz="4" w:color="BFBFBF"/>
+            </w:tcBorders>
+            <w:vAlign w:val="center"/>
+          </w:tcPr>
+          <w:p>
+            <w:r/>
+            <w:r>
+              <w:rPr>
+                <w:rFonts w:ascii="Arial" w:hAnsi="Arial" w:cs="Arial"/>
+                <w:b w:val="0"/>
+                <w:i w:val="0"/>
+                <w:color w:val="000000"/>
+                <w:sz w:val="20"/>
+              </w:rPr>
+            </w:r>
+          </w:p>
+        </w:tc>
+        <w:tc>
+          <w:tcPr>
+            <w:tcW w:type="dxa" w:w="1600"/>
+            <w:tcBorders>
+              <w:top w:val="single" w:sz="4" w:color="BFBFBF"/>
+              <w:left w:val="single" w:sz="4" w:color="BFBFBF"/>
+              <w:bottom w:val="single" w:sz="4" w:color="BFBFBF"/>
+              <w:right w:val="single" w:sz="4" w:color="BFBFBF"/>
+            </w:tcBorders>
+            <w:vAlign w:val="center"/>
+          </w:tcPr>
+          <w:p>
+            <w:r/>
+            <w:r>
+              <w:rPr>
+                <w:rFonts w:ascii="Arial" w:hAnsi="Arial" w:cs="Arial"/>
+                <w:b w:val="0"/>
+                <w:i w:val="0"/>
+                <w:color w:val="000000"/>
+                <w:sz w:val="20"/>
+              </w:rPr>
+            </w:r>
+          </w:p>
+        </w:tc>
+      </w:tr>
+      <w:tr>
+        <w:tc>
+          <w:tcPr>
+            <w:tcW w:type="dxa" w:w="800"/>
+            <w:tcBorders>
+              <w:top w:val="single" w:sz="4" w:color="BFBFBF"/>
+              <w:left w:val="single" w:sz="4" w:color="BFBFBF"/>
+              <w:bottom w:val="single" w:sz="4" w:color="BFBFBF"/>
+              <w:right w:val="single" w:sz="4" w:color="BFBFBF"/>
+            </w:tcBorders>
+            <w:vAlign w:val="center"/>
+          </w:tcPr>
+          <w:p>
+            <w:pPr>
+              <w:jc w:val="center"/>
+            </w:pPr>
+            <w:r/>
+            <w:r>
+              <w:rPr>
+                <w:rFonts w:ascii="Arial" w:hAnsi="Arial" w:cs="Arial"/>
+                <w:b/>
+                <w:i w:val="0"/>
+                <w:color w:val="000000"/>
+                <w:sz w:val="20"/>
+              </w:rPr>
+              <w:t>{{ loop.index }}</w:t>
+            </w:r>
+          </w:p>
+        </w:tc>
+        <w:tc>
+          <w:tcPr>
+            <w:tcW w:type="dxa" w:w="2600"/>
+            <w:tcBorders>
+              <w:top w:val="single" w:sz="4" w:color="BFBFBF"/>
+              <w:left w:val="single" w:sz="4" w:color="BFBFBF"/>
+              <w:bottom w:val="single" w:sz="4" w:color="BFBFBF"/>
+              <w:right w:val="single" w:sz="4" w:color="BFBFBF"/>
+            </w:tcBorders>
+            <w:vAlign w:val="center"/>
+          </w:tcPr>
+          <w:p>
+            <w:r/>
+            <w:r>
+              <w:rPr>
+                <w:rFonts w:ascii="Arial" w:hAnsi="Arial" w:cs="Arial"/>
+                <w:b w:val="0"/>
+                <w:i w:val="0"/>
+                <w:color w:val="000000"/>
+                <w:sz w:val="20"/>
+              </w:rPr>
+              <w:t>{{ step.name }}</w:t>
+            </w:r>
+          </w:p>
+        </w:tc>
+        <w:tc>
+          <w:tcPr>
+            <w:tcW w:type="dxa" w:w="4800"/>
+            <w:tcBorders>
+              <w:top w:val="single" w:sz="4" w:color="BFBFBF"/>
+              <w:left w:val="single" w:sz="4" w:color="BFBFBF"/>
+              <w:bottom w:val="single" w:sz="4" w:color="BFBFBF"/>
+              <w:right w:val="single" w:sz="4" w:color="BFBFBF"/>
+            </w:tcBorders>
+            <w:vAlign w:val="center"/>
+          </w:tcPr>
+          <w:p>
+            <w:r/>
+            <w:r>
+              <w:rPr>
+                <w:rFonts w:ascii="Arial" w:hAnsi="Arial" w:cs="Arial"/>
+                <w:b w:val="0"/>
+                <w:i w:val="0"/>
+                <w:color w:val="000000"/>
+                <w:sz w:val="20"/>
+              </w:rPr>
+              <w:t>{{ step.description }}</w:t>
+            </w:r>
+          </w:p>
+        </w:tc>
+        <w:tc>
+          <w:tcPr>
+            <w:tcW w:type="dxa" w:w="1600"/>
+            <w:tcBorders>
+              <w:top w:val="single" w:sz="4" w:color="BFBFBF"/>
+              <w:left w:val="single" w:sz="4" w:color="BFBFBF"/>
+              <w:bottom w:val="single" w:sz="4" w:color="BFBFBF"/>
+              <w:right w:val="single" w:sz="4" w:color="BFBFBF"/>
+            </w:tcBorders>
+            <w:vAlign w:val="center"/>
+          </w:tcPr>
+          <w:p>
+            <w:pPr>
+              <w:jc w:val="center"/>
+            </w:pPr>
+            <w:r/>
+            <w:r>
+              <w:rPr>
+                <w:rFonts w:ascii="Arial" w:hAnsi="Arial" w:cs="Arial"/>
+                <w:b w:val="0"/>
+                <w:i w:val="0"/>
+                <w:color w:val="000000"/>
+                <w:sz w:val="20"/>
+              </w:rPr>
+              <w:t>{{ step.duration_min }} min</w:t>
+            </w:r>
+          </w:p>
+        </w:tc>
+      </w:tr>
+      <w:tr>
+        <w:tc>
+          <w:tcPr>
+            <w:tcW w:type="dxa" w:w="800"/>
+            <w:tcBorders>
+              <w:top w:val="single" w:sz="4" w:color="BFBFBF"/>
+              <w:left w:val="single" w:sz="4" w:color="BFBFBF"/>
+              <w:bottom w:val="single" w:sz="4" w:color="BFBFBF"/>
+              <w:right w:val="single" w:sz="4" w:color="BFBFBF"/>
+            </w:tcBorders>
+            <w:vAlign w:val="center"/>
+          </w:tcPr>
+          <w:p>
+            <w:r/>
+            <w:r>
+              <w:rPr>
+                <w:rFonts w:ascii="Arial" w:hAnsi="Arial" w:cs="Arial"/>
+                <w:b w:val="0"/>
+                <w:i w:val="0"/>
+                <w:color w:val="5F6368"/>
+                <w:sz w:val="16"/>
+              </w:rPr>
+              <w:t>{%tr endfor %}</w:t>
+            </w:r>
+          </w:p>
+        </w:tc>
+        <w:tc>
+          <w:tcPr>
+            <w:tcW w:type="dxa" w:w="2600"/>
+            <w:tcBorders>
+              <w:top w:val="single" w:sz="4" w:color="BFBFBF"/>
+              <w:left w:val="single" w:sz="4" w:color="BFBFBF"/>
+              <w:bottom w:val="single" w:sz="4" w:color="BFBFBF"/>
+              <w:right w:val="single" w:sz="4" w:color="BFBFBF"/>
+            </w:tcBorders>
+            <w:vAlign w:val="center"/>
+          </w:tcPr>
+          <w:p>
+            <w:r/>
+            <w:r>
+              <w:rPr>
+                <w:rFonts w:ascii="Arial" w:hAnsi="Arial" w:cs="Arial"/>
+                <w:b w:val="0"/>
+                <w:i w:val="0"/>
+                <w:color w:val="000000"/>
+                <w:sz w:val="20"/>
+              </w:rPr>
+            </w:r>
+          </w:p>
+        </w:tc>
+        <w:tc>
+          <w:tcPr>
+            <w:tcW w:type="dxa" w:w="4800"/>
+            <w:tcBorders>
+              <w:top w:val="single" w:sz="4" w:color="BFBFBF"/>
+              <w:left w:val="single" w:sz="4" w:color="BFBFBF"/>
+              <w:bottom w:val="single" w:sz="4" w:color="BFBFBF"/>
+              <w:right w:val="single" w:sz="4" w:color="BFBFBF"/>
+            </w:tcBorders>
+            <w:vAlign w:val="center"/>
+          </w:tcPr>
+          <w:p>
+            <w:r/>
+            <w:r>
+              <w:rPr>
+                <w:rFonts w:ascii="Arial" w:hAnsi="Arial" w:cs="Arial"/>
+                <w:b w:val="0"/>
+                <w:i w:val="0"/>
+                <w:color w:val="000000"/>
+                <w:sz w:val="20"/>
+              </w:rPr>
+            </w:r>
+          </w:p>
+        </w:tc>
+        <w:tc>
+          <w:tcPr>
+            <w:tcW w:type="dxa" w:w="1600"/>
+            <w:tcBorders>
+              <w:top w:val="single" w:sz="4" w:color="BFBFBF"/>
+              <w:left w:val="single" w:sz="4" w:color="BFBFBF"/>
+              <w:bottom w:val="single" w:sz="4" w:color="BFBFBF"/>
+              <w:right w:val="single" w:sz="4" w:color="BFBFBF"/>
+            </w:tcBorders>
+            <w:vAlign w:val="center"/>
+          </w:tcPr>
+          <w:p>
+            <w:r/>
+            <w:r>
+              <w:rPr>
+                <w:rFonts w:ascii="Arial" w:hAnsi="Arial" w:cs="Arial"/>
+                <w:b w:val="0"/>
+                <w:i w:val="0"/>
+                <w:color w:val="000000"/>
+                <w:sz w:val="20"/>
+              </w:rPr>
+            </w:r>
+          </w:p>
+        </w:tc>
+      </w:tr>
+    </w:tbl>
     <w:p>
       <w:pPr>
-        <w:spacing w:after="40"/>
+        <w:spacing w:before="0" w:after="0"/>
       </w:pPr>
       <w:r>
         <w:rPr>
-          <w:b/>
-          <w:i w:val="0"/>
-          <w:color w:val="0F172A"/>
-          <w:sz w:val="22"/>
-        </w:rPr>
-        <w:t>{{ loop.index }}. {{ step.name }}</w:t>
-      </w:r>
-    </w:p>
-    <w:p>
-      <w:pPr>
-        <w:spacing w:before="0" w:after="100"/>
-      </w:pPr>
-      <w:r>
-        <w:t>{{r step.sop_body }}</w:t>
-      </w:r>
-    </w:p>
-    <w:p>
-      <w:pPr>
-        <w:spacing w:after="0"/>
-      </w:pPr>
-      <w:r>
-        <w:rPr>
+          <w:rFonts w:ascii="Arial" w:hAnsi="Arial" w:cs="Arial"/>
           <w:b w:val="0"/>
           <w:i w:val="0"/>
-          <w:color w:val="334155"/>
-          <w:sz w:val="2"/>
+          <w:color w:val="5F6368"/>
+          <w:sz w:val="16"/>
         </w:rPr>
         <w:t>{%p endfor %}</w:t>
       </w:r>
     </w:p>
     <w:p>
       <w:pPr>
-        <w:spacing w:after="0"/>
+        <w:spacing w:before="0" w:after="0"/>
       </w:pPr>
       <w:r>
         <w:rPr>
+          <w:rFonts w:ascii="Arial" w:hAnsi="Arial" w:cs="Arial"/>
           <w:b w:val="0"/>
           <w:i w:val="0"/>
-          <w:color w:val="334155"/>
-          <w:sz w:val="2"/>
+          <w:color w:val="5F6368"/>
+          <w:sz w:val="16"/>
         </w:rPr>
-        <w:t>{%p endfor %}</w:t>
+        <w:t>{%p else %}</w:t>
+      </w:r>
+    </w:p>
+    <w:tbl>
+      <w:tblPr>
+        <w:tblW w:type="auto" w:w="0"/>
+        <w:tblLook w:firstColumn="1" w:firstRow="1" w:lastColumn="0" w:lastRow="0" w:noHBand="0" w:noVBand="1" w:val="04A0"/>
+        <w:tblLayout w:type="fixed"/>
+      </w:tblPr>
+      <w:tblGrid>
+        <w:gridCol w:w="2520"/>
+        <w:gridCol w:w="2520"/>
+        <w:gridCol w:w="2520"/>
+        <w:gridCol w:w="2520"/>
+      </w:tblGrid>
+      <w:tr>
+        <w:tc>
+          <w:tcPr>
+            <w:tcW w:type="dxa" w:w="800"/>
+            <w:shd w:val="clear" w:color="auto" w:fill="ECF0F1"/>
+            <w:tcBorders>
+              <w:top w:val="single" w:sz="4" w:color="BFBFBF"/>
+              <w:left w:val="single" w:sz="4" w:color="BFBFBF"/>
+              <w:bottom w:val="single" w:sz="4" w:color="BFBFBF"/>
+              <w:right w:val="single" w:sz="4" w:color="BFBFBF"/>
+            </w:tcBorders>
+            <w:vAlign w:val="center"/>
+          </w:tcPr>
+          <w:p>
+            <w:pPr>
+              <w:jc w:val="center"/>
+            </w:pPr>
+            <w:r/>
+            <w:r>
+              <w:rPr>
+                <w:rFonts w:ascii="Arial" w:hAnsi="Arial" w:cs="Arial"/>
+                <w:b/>
+                <w:i w:val="0"/>
+                <w:color w:val="000000"/>
+                <w:sz w:val="20"/>
+              </w:rPr>
+              <w:t>Step</w:t>
+            </w:r>
+          </w:p>
+        </w:tc>
+        <w:tc>
+          <w:tcPr>
+            <w:tcW w:type="dxa" w:w="2600"/>
+            <w:shd w:val="clear" w:color="auto" w:fill="ECF0F1"/>
+            <w:tcBorders>
+              <w:top w:val="single" w:sz="4" w:color="BFBFBF"/>
+              <w:left w:val="single" w:sz="4" w:color="BFBFBF"/>
+              <w:bottom w:val="single" w:sz="4" w:color="BFBFBF"/>
+              <w:right w:val="single" w:sz="4" w:color="BFBFBF"/>
+            </w:tcBorders>
+            <w:vAlign w:val="center"/>
+          </w:tcPr>
+          <w:p>
+            <w:pPr>
+              <w:jc w:val="center"/>
+            </w:pPr>
+            <w:r/>
+            <w:r>
+              <w:rPr>
+                <w:rFonts w:ascii="Arial" w:hAnsi="Arial" w:cs="Arial"/>
+                <w:b/>
+                <w:i w:val="0"/>
+                <w:color w:val="000000"/>
+                <w:sz w:val="20"/>
+              </w:rPr>
+              <w:t>Name</w:t>
+            </w:r>
+          </w:p>
+        </w:tc>
+        <w:tc>
+          <w:tcPr>
+            <w:tcW w:type="dxa" w:w="4800"/>
+            <w:shd w:val="clear" w:color="auto" w:fill="ECF0F1"/>
+            <w:tcBorders>
+              <w:top w:val="single" w:sz="4" w:color="BFBFBF"/>
+              <w:left w:val="single" w:sz="4" w:color="BFBFBF"/>
+              <w:bottom w:val="single" w:sz="4" w:color="BFBFBF"/>
+              <w:right w:val="single" w:sz="4" w:color="BFBFBF"/>
+            </w:tcBorders>
+            <w:vAlign w:val="center"/>
+          </w:tcPr>
+          <w:p>
+            <w:pPr>
+              <w:jc w:val="center"/>
+            </w:pPr>
+            <w:r/>
+            <w:r>
+              <w:rPr>
+                <w:rFonts w:ascii="Arial" w:hAnsi="Arial" w:cs="Arial"/>
+                <w:b/>
+                <w:i w:val="0"/>
+                <w:color w:val="000000"/>
+                <w:sz w:val="20"/>
+              </w:rPr>
+              <w:t>Instruction</w:t>
+            </w:r>
+          </w:p>
+        </w:tc>
+        <w:tc>
+          <w:tcPr>
+            <w:tcW w:type="dxa" w:w="1600"/>
+            <w:shd w:val="clear" w:color="auto" w:fill="ECF0F1"/>
+            <w:tcBorders>
+              <w:top w:val="single" w:sz="4" w:color="BFBFBF"/>
+              <w:left w:val="single" w:sz="4" w:color="BFBFBF"/>
+              <w:bottom w:val="single" w:sz="4" w:color="BFBFBF"/>
+              <w:right w:val="single" w:sz="4" w:color="BFBFBF"/>
+            </w:tcBorders>
+            <w:vAlign w:val="center"/>
+          </w:tcPr>
+          <w:p>
+            <w:pPr>
+              <w:jc w:val="center"/>
+            </w:pPr>
+            <w:r/>
+            <w:r>
+              <w:rPr>
+                <w:rFonts w:ascii="Arial" w:hAnsi="Arial" w:cs="Arial"/>
+                <w:b/>
+                <w:i w:val="0"/>
+                <w:color w:val="000000"/>
+                <w:sz w:val="20"/>
+              </w:rPr>
+              <w:t>Duration</w:t>
+            </w:r>
+          </w:p>
+        </w:tc>
+      </w:tr>
+      <w:tr>
+        <w:tc>
+          <w:tcPr>
+            <w:tcW w:type="dxa" w:w="800"/>
+            <w:tcBorders>
+              <w:top w:val="single" w:sz="4" w:color="BFBFBF"/>
+              <w:left w:val="single" w:sz="4" w:color="BFBFBF"/>
+              <w:bottom w:val="single" w:sz="4" w:color="BFBFBF"/>
+              <w:right w:val="single" w:sz="4" w:color="BFBFBF"/>
+            </w:tcBorders>
+            <w:vAlign w:val="center"/>
+          </w:tcPr>
+          <w:p>
+            <w:r/>
+            <w:r>
+              <w:rPr>
+                <w:rFonts w:ascii="Arial" w:hAnsi="Arial" w:cs="Arial"/>
+                <w:b w:val="0"/>
+                <w:i w:val="0"/>
+                <w:color w:val="5F6368"/>
+                <w:sz w:val="16"/>
+              </w:rPr>
+              <w:t>{%tr for step in steps %}</w:t>
+            </w:r>
+          </w:p>
+        </w:tc>
+        <w:tc>
+          <w:tcPr>
+            <w:tcW w:type="dxa" w:w="2600"/>
+            <w:tcBorders>
+              <w:top w:val="single" w:sz="4" w:color="BFBFBF"/>
+              <w:left w:val="single" w:sz="4" w:color="BFBFBF"/>
+              <w:bottom w:val="single" w:sz="4" w:color="BFBFBF"/>
+              <w:right w:val="single" w:sz="4" w:color="BFBFBF"/>
+            </w:tcBorders>
+            <w:vAlign w:val="center"/>
+          </w:tcPr>
+          <w:p>
+            <w:r/>
+            <w:r>
+              <w:rPr>
+                <w:rFonts w:ascii="Arial" w:hAnsi="Arial" w:cs="Arial"/>
+                <w:b w:val="0"/>
+                <w:i w:val="0"/>
+                <w:color w:val="000000"/>
+                <w:sz w:val="20"/>
+              </w:rPr>
+            </w:r>
+          </w:p>
+        </w:tc>
+        <w:tc>
+          <w:tcPr>
+            <w:tcW w:type="dxa" w:w="4800"/>
+            <w:tcBorders>
+              <w:top w:val="single" w:sz="4" w:color="BFBFBF"/>
+              <w:left w:val="single" w:sz="4" w:color="BFBFBF"/>
+              <w:bottom w:val="single" w:sz="4" w:color="BFBFBF"/>
+              <w:right w:val="single" w:sz="4" w:color="BFBFBF"/>
+            </w:tcBorders>
+            <w:vAlign w:val="center"/>
+          </w:tcPr>
+          <w:p>
+            <w:r/>
+            <w:r>
+              <w:rPr>
+                <w:rFonts w:ascii="Arial" w:hAnsi="Arial" w:cs="Arial"/>
+                <w:b w:val="0"/>
+                <w:i w:val="0"/>
+                <w:color w:val="000000"/>
+                <w:sz w:val="20"/>
+              </w:rPr>
+            </w:r>
+          </w:p>
+        </w:tc>
+        <w:tc>
+          <w:tcPr>
+            <w:tcW w:type="dxa" w:w="1600"/>
+            <w:tcBorders>
+              <w:top w:val="single" w:sz="4" w:color="BFBFBF"/>
+              <w:left w:val="single" w:sz="4" w:color="BFBFBF"/>
+              <w:bottom w:val="single" w:sz="4" w:color="BFBFBF"/>
+              <w:right w:val="single" w:sz="4" w:color="BFBFBF"/>
+            </w:tcBorders>
+            <w:vAlign w:val="center"/>
+          </w:tcPr>
+          <w:p>
+            <w:r/>
+            <w:r>
+              <w:rPr>
+                <w:rFonts w:ascii="Arial" w:hAnsi="Arial" w:cs="Arial"/>
+                <w:b w:val="0"/>
+                <w:i w:val="0"/>
+                <w:color w:val="000000"/>
+                <w:sz w:val="20"/>
+              </w:rPr>
+            </w:r>
+          </w:p>
+        </w:tc>
+      </w:tr>
+      <w:tr>
+        <w:tc>
+          <w:tcPr>
+            <w:tcW w:type="dxa" w:w="800"/>
+            <w:tcBorders>
+              <w:top w:val="single" w:sz="4" w:color="BFBFBF"/>
+              <w:left w:val="single" w:sz="4" w:color="BFBFBF"/>
+              <w:bottom w:val="single" w:sz="4" w:color="BFBFBF"/>
+              <w:right w:val="single" w:sz="4" w:color="BFBFBF"/>
+            </w:tcBorders>
+            <w:vAlign w:val="center"/>
+          </w:tcPr>
+          <w:p>
+            <w:pPr>
+              <w:jc w:val="center"/>
+            </w:pPr>
+            <w:r/>
+            <w:r>
+              <w:rPr>
+                <w:rFonts w:ascii="Arial" w:hAnsi="Arial" w:cs="Arial"/>
+                <w:b/>
+                <w:i w:val="0"/>
+                <w:color w:val="000000"/>
+                <w:sz w:val="20"/>
+              </w:rPr>
+              <w:t>{{ loop.index }}</w:t>
+            </w:r>
+          </w:p>
+        </w:tc>
+        <w:tc>
+          <w:tcPr>
+            <w:tcW w:type="dxa" w:w="2600"/>
+            <w:tcBorders>
+              <w:top w:val="single" w:sz="4" w:color="BFBFBF"/>
+              <w:left w:val="single" w:sz="4" w:color="BFBFBF"/>
+              <w:bottom w:val="single" w:sz="4" w:color="BFBFBF"/>
+              <w:right w:val="single" w:sz="4" w:color="BFBFBF"/>
+            </w:tcBorders>
+            <w:vAlign w:val="center"/>
+          </w:tcPr>
+          <w:p>
+            <w:r/>
+            <w:r>
+              <w:rPr>
+                <w:rFonts w:ascii="Arial" w:hAnsi="Arial" w:cs="Arial"/>
+                <w:b w:val="0"/>
+                <w:i w:val="0"/>
+                <w:color w:val="000000"/>
+                <w:sz w:val="20"/>
+              </w:rPr>
+              <w:t>{{ step.name }}</w:t>
+            </w:r>
+          </w:p>
+        </w:tc>
+        <w:tc>
+          <w:tcPr>
+            <w:tcW w:type="dxa" w:w="4800"/>
+            <w:tcBorders>
+              <w:top w:val="single" w:sz="4" w:color="BFBFBF"/>
+              <w:left w:val="single" w:sz="4" w:color="BFBFBF"/>
+              <w:bottom w:val="single" w:sz="4" w:color="BFBFBF"/>
+              <w:right w:val="single" w:sz="4" w:color="BFBFBF"/>
+            </w:tcBorders>
+            <w:vAlign w:val="center"/>
+          </w:tcPr>
+          <w:p>
+            <w:r/>
+            <w:r>
+              <w:rPr>
+                <w:rFonts w:ascii="Arial" w:hAnsi="Arial" w:cs="Arial"/>
+                <w:b w:val="0"/>
+                <w:i w:val="0"/>
+                <w:color w:val="000000"/>
+                <w:sz w:val="20"/>
+              </w:rPr>
+              <w:t>{{ step.description }}</w:t>
+            </w:r>
+          </w:p>
+        </w:tc>
+        <w:tc>
+          <w:tcPr>
+            <w:tcW w:type="dxa" w:w="1600"/>
+            <w:tcBorders>
+              <w:top w:val="single" w:sz="4" w:color="BFBFBF"/>
+              <w:left w:val="single" w:sz="4" w:color="BFBFBF"/>
+              <w:bottom w:val="single" w:sz="4" w:color="BFBFBF"/>
+              <w:right w:val="single" w:sz="4" w:color="BFBFBF"/>
+            </w:tcBorders>
+            <w:vAlign w:val="center"/>
+          </w:tcPr>
+          <w:p>
+            <w:pPr>
+              <w:jc w:val="center"/>
+            </w:pPr>
+            <w:r/>
+            <w:r>
+              <w:rPr>
+                <w:rFonts w:ascii="Arial" w:hAnsi="Arial" w:cs="Arial"/>
+                <w:b w:val="0"/>
+                <w:i w:val="0"/>
+                <w:color w:val="000000"/>
+                <w:sz w:val="20"/>
+              </w:rPr>
+              <w:t>{{ step.duration_min }} min</w:t>
+            </w:r>
+          </w:p>
+        </w:tc>
+      </w:tr>
+      <w:tr>
+        <w:tc>
+          <w:tcPr>
+            <w:tcW w:type="dxa" w:w="800"/>
+            <w:tcBorders>
+              <w:top w:val="single" w:sz="4" w:color="BFBFBF"/>
+              <w:left w:val="single" w:sz="4" w:color="BFBFBF"/>
+              <w:bottom w:val="single" w:sz="4" w:color="BFBFBF"/>
+              <w:right w:val="single" w:sz="4" w:color="BFBFBF"/>
+            </w:tcBorders>
+            <w:vAlign w:val="center"/>
+          </w:tcPr>
+          <w:p>
+            <w:r/>
+            <w:r>
+              <w:rPr>
+                <w:rFonts w:ascii="Arial" w:hAnsi="Arial" w:cs="Arial"/>
+                <w:b w:val="0"/>
+                <w:i w:val="0"/>
+                <w:color w:val="5F6368"/>
+                <w:sz w:val="16"/>
+              </w:rPr>
+              <w:t>{%tr endfor %}</w:t>
+            </w:r>
+          </w:p>
+        </w:tc>
+        <w:tc>
+          <w:tcPr>
+            <w:tcW w:type="dxa" w:w="2600"/>
+            <w:tcBorders>
+              <w:top w:val="single" w:sz="4" w:color="BFBFBF"/>
+              <w:left w:val="single" w:sz="4" w:color="BFBFBF"/>
+              <w:bottom w:val="single" w:sz="4" w:color="BFBFBF"/>
+              <w:right w:val="single" w:sz="4" w:color="BFBFBF"/>
+            </w:tcBorders>
+            <w:vAlign w:val="center"/>
+          </w:tcPr>
+          <w:p>
+            <w:r/>
+            <w:r>
+              <w:rPr>
+                <w:rFonts w:ascii="Arial" w:hAnsi="Arial" w:cs="Arial"/>
+                <w:b w:val="0"/>
+                <w:i w:val="0"/>
+                <w:color w:val="000000"/>
+                <w:sz w:val="20"/>
+              </w:rPr>
+            </w:r>
+          </w:p>
+        </w:tc>
+        <w:tc>
+          <w:tcPr>
+            <w:tcW w:type="dxa" w:w="4800"/>
+            <w:tcBorders>
+              <w:top w:val="single" w:sz="4" w:color="BFBFBF"/>
+              <w:left w:val="single" w:sz="4" w:color="BFBFBF"/>
+              <w:bottom w:val="single" w:sz="4" w:color="BFBFBF"/>
+              <w:right w:val="single" w:sz="4" w:color="BFBFBF"/>
+            </w:tcBorders>
+            <w:vAlign w:val="center"/>
+          </w:tcPr>
+          <w:p>
+            <w:r/>
+            <w:r>
+              <w:rPr>
+                <w:rFonts w:ascii="Arial" w:hAnsi="Arial" w:cs="Arial"/>
+                <w:b w:val="0"/>
+                <w:i w:val="0"/>
+                <w:color w:val="000000"/>
+                <w:sz w:val="20"/>
+              </w:rPr>
+            </w:r>
+          </w:p>
+        </w:tc>
+        <w:tc>
+          <w:tcPr>
+            <w:tcW w:type="dxa" w:w="1600"/>
+            <w:tcBorders>
+              <w:top w:val="single" w:sz="4" w:color="BFBFBF"/>
+              <w:left w:val="single" w:sz="4" w:color="BFBFBF"/>
+              <w:bottom w:val="single" w:sz="4" w:color="BFBFBF"/>
+              <w:right w:val="single" w:sz="4" w:color="BFBFBF"/>
+            </w:tcBorders>
+            <w:vAlign w:val="center"/>
+          </w:tcPr>
+          <w:p>
+            <w:r/>
+            <w:r>
+              <w:rPr>
+                <w:rFonts w:ascii="Arial" w:hAnsi="Arial" w:cs="Arial"/>
+                <w:b w:val="0"/>
+                <w:i w:val="0"/>
+                <w:color w:val="000000"/>
+                <w:sz w:val="20"/>
+              </w:rPr>
+            </w:r>
+          </w:p>
+        </w:tc>
+      </w:tr>
+    </w:tbl>
+    <w:p>
+      <w:pPr>
+        <w:spacing w:before="0" w:after="0"/>
+      </w:pPr>
+      <w:r>
+        <w:rPr>
+          <w:rFonts w:ascii="Arial" w:hAnsi="Arial" w:cs="Arial"/>
+          <w:b w:val="0"/>
+          <w:i w:val="0"/>
+          <w:color w:val="5F6368"/>
+          <w:sz w:val="16"/>
+        </w:rPr>
+        <w:t>{%p endif %}</w:t>
       </w:r>
     </w:p>
     <w:p>
       <w:pPr>
-        <w:spacing w:after="0"/>
+        <w:spacing w:before="0" w:after="0"/>
       </w:pPr>
       <w:r>
         <w:rPr>
+          <w:rFonts w:ascii="Arial" w:hAnsi="Arial" w:cs="Arial"/>
           <w:b w:val="0"/>
           <w:i w:val="0"/>
-          <w:color w:val="334155"/>
-          <w:sz w:val="2"/>
+          <w:color w:val="5F6368"/>
+          <w:sz w:val="16"/>
         </w:rPr>
-        <w:t>{{r page_break }}</w:t>
+        <w:t>{%p endif %}</w:t>
       </w:r>
     </w:p>
     <w:p>
       <w:pPr>
-        <w:spacing w:after="120" w:before="0"/>
+        <w:spacing w:before="0" w:after="0"/>
       </w:pPr>
       <w:r>
         <w:rPr>
+          <w:rFonts w:ascii="Arial" w:hAnsi="Arial" w:cs="Arial"/>
           <w:b w:val="0"/>
           <w:i w:val="0"/>
-          <w:color w:val="C8C8C8"/>
-          <w:sz w:val="12"/>
+          <w:color w:val="5F6368"/>
+          <w:sz w:val="16"/>
         </w:rPr>
-        <w:t>──────────────────────────────────────────────────</w:t>
+        <w:t>{%p if approval %}</w:t>
       </w:r>
     </w:p>
     <w:p>
       <w:pPr>
-        <w:spacing w:after="320" w:before="0"/>
+        <w:keepNext/>
+        <w:spacing w:before="320" w:after="120"/>
+        <w:pBdr>
+          <w:bottom w:val="single" w:sz="8" w:space="4" w:color="D1D5DB"/>
+        </w:pBdr>
       </w:pPr>
       <w:r>
         <w:rPr>
+          <w:rFonts w:ascii="Arial" w:hAnsi="Arial" w:cs="Arial"/>
           <w:b/>
           <w:i w:val="0"/>
-          <w:color w:val="0F172A"/>
-          <w:sz w:val="22"/>
+          <w:color w:val="1F3A5F"/>
+          <w:sz w:val="32"/>
         </w:rPr>
-        <w:t>Approvals</w:t>
+        <w:t>Approval &amp; Signatures</w:t>
       </w:r>
     </w:p>
     <w:p>
       <w:pPr>
-        <w:spacing w:after="40"/>
+        <w:spacing w:after="80"/>
       </w:pPr>
       <w:r>
         <w:rPr>
-          <w:color w:val="787878"/>
-          <w:sz w:val="18"/>
+          <w:rFonts w:ascii="Arial" w:hAnsi="Arial" w:cs="Arial"/>
+          <w:b w:val="0"/>
+          <w:i w:val="0"/>
+          <w:color w:val="000000"/>
+          <w:sz w:val="20"/>
         </w:rPr>
-        <w:t>____________________________</w:t>
-        <w:tab/>
-        <w:tab/>
-        <w:tab/>
+        <w:t>Approver: {{ approval.approver_name }} &lt;{{ approval.approver_email }}&gt;</w:t>
       </w:r>
+    </w:p>
+    <w:p>
+      <w:pPr>
+        <w:spacing w:after="80"/>
+      </w:pPr>
       <w:r>
         <w:rPr>
-          <w:color w:val="787878"/>
-          <w:sz w:val="18"/>
+          <w:rFonts w:ascii="Arial" w:hAnsi="Arial" w:cs="Arial"/>
+          <w:b w:val="0"/>
+          <w:i w:val="0"/>
+          <w:color w:val="5F6368"/>
+          <w:sz w:val="20"/>
         </w:rPr>
-        <w:t>____________________________</w:t>
+        <w:t>Approved at: {{ approval.approved_at }}    Protocol version: {{ approval.protocol_version }}</w:t>
+      </w:r>
+    </w:p>
+    <w:p>
+      <w:pPr>
+        <w:spacing w:before="0" w:after="0"/>
+      </w:pPr>
+      <w:r>
+        <w:rPr>
+          <w:rFonts w:ascii="Arial" w:hAnsi="Arial" w:cs="Arial"/>
+          <w:b w:val="0"/>
+          <w:i w:val="0"/>
+          <w:color w:val="5F6368"/>
+          <w:sz w:val="16"/>
+        </w:rPr>
+        <w:t>{%p if approval.signature_statement %}</w:t>
       </w:r>
     </w:p>
     <w:p>
       <w:r>
         <w:rPr>
-          <w:color w:val="787878"/>
-          <w:sz w:val="18"/>
+          <w:rFonts w:ascii="Arial" w:hAnsi="Arial" w:cs="Arial"/>
+          <w:b w:val="0"/>
+          <w:i/>
+          <w:color w:val="000000"/>
+          <w:sz w:val="20"/>
         </w:rPr>
-        <w:t>Prepared by (Name / Date)</w:t>
-        <w:tab/>
-        <w:tab/>
-      </w:r>
-      <w:r>
-        <w:rPr>
-          <w:color w:val="787878"/>
-          <w:sz w:val="18"/>
-        </w:rPr>
-        <w:t>Reviewed by (Name / Date)</w:t>
-      </w:r>
-    </w:p>
-    <w:p>
-      <w:r>
-        <w:t>{# BR-APPROVAL-BLOCK #}</w:t>
-      </w:r>
-    </w:p>
-    <w:p>
-      <w:r>
-        <w:t>{%p if approval %}</w:t>
-      </w:r>
-    </w:p>
-    <w:p>
-      <w:r>
-        <w:t>Approval &amp; Signatures</w:t>
-      </w:r>
-    </w:p>
-    <w:p>
-      <w:r>
-        <w:t>Approver: {{ approval.approver_name }} &lt;{{ approval.approver_email }}&gt;</w:t>
-      </w:r>
-    </w:p>
-    <w:p>
-      <w:r>
-        <w:t>Approved at: {{ approval.approved_at }}    Protocol version: {{ approval.protocol_version }}</w:t>
-      </w:r>
-    </w:p>
-    <w:p>
-      <w:r>
-        <w:t>{%p if approval.signature_statement %}</w:t>
-      </w:r>
-    </w:p>
-    <w:p>
-      <w:r>
         <w:t>Statement: {{ approval.signature_statement }}</w:t>
       </w:r>
     </w:p>
     <w:p>
+      <w:pPr>
+        <w:spacing w:before="0" w:after="0"/>
+      </w:pPr>
       <w:r>
+        <w:rPr>
+          <w:rFonts w:ascii="Arial" w:hAnsi="Arial" w:cs="Arial"/>
+          <w:b w:val="0"/>
+          <w:i w:val="0"/>
+          <w:color w:val="5F6368"/>
+          <w:sz w:val="16"/>
+        </w:rPr>
         <w:t>{%p endif %}</w:t>
       </w:r>
     </w:p>
     <w:p>
+      <w:pPr>
+        <w:spacing w:before="0" w:after="0"/>
+      </w:pPr>
       <w:r>
+        <w:rPr>
+          <w:rFonts w:ascii="Arial" w:hAnsi="Arial" w:cs="Arial"/>
+          <w:b w:val="0"/>
+          <w:i w:val="0"/>
+          <w:color w:val="5F6368"/>
+          <w:sz w:val="16"/>
+        </w:rPr>
         <w:t>{%p if approval.signature_image %}</w:t>
       </w:r>
     </w:p>
     <w:p>
       <w:r>
-        <w:t>Signature: {{ approval.signature_image }}</w:t>
+        <w:rPr>
+          <w:rFonts w:ascii="Arial" w:hAnsi="Arial" w:cs="Arial"/>
+          <w:b/>
+          <w:i w:val="0"/>
+          <w:color w:val="000000"/>
+          <w:sz w:val="20"/>
+        </w:rPr>
+        <w:t xml:space="preserve">Signature: </w:t>
+      </w:r>
+      <w:r>
+        <w:rPr>
+          <w:rFonts w:ascii="Arial" w:hAnsi="Arial" w:cs="Arial"/>
+          <w:b w:val="0"/>
+          <w:i w:val="0"/>
+          <w:color w:val="000000"/>
+          <w:sz w:val="20"/>
+        </w:rPr>
+        <w:t>{{ approval.signature_image }}</w:t>
       </w:r>
     </w:p>
     <w:p>
+      <w:pPr>
+        <w:spacing w:before="0" w:after="0"/>
+      </w:pPr>
       <w:r>
+        <w:rPr>
+          <w:rFonts w:ascii="Arial" w:hAnsi="Arial" w:cs="Arial"/>
+          <w:b w:val="0"/>
+          <w:i w:val="0"/>
+          <w:color w:val="5F6368"/>
+          <w:sz w:val="16"/>
+        </w:rPr>
         <w:t>{%p endif %}</w:t>
       </w:r>
     </w:p>
     <w:p>
+      <w:pPr>
+        <w:spacing w:before="0" w:after="0"/>
+      </w:pPr>
       <w:r>
+        <w:rPr>
+          <w:rFonts w:ascii="Arial" w:hAnsi="Arial" w:cs="Arial"/>
+          <w:b w:val="0"/>
+          <w:i w:val="0"/>
+          <w:color w:val="5F6368"/>
+          <w:sz w:val="16"/>
+        </w:rPr>
         <w:t>{%p endif %}</w:t>
       </w:r>
     </w:p>
     <w:p>
+      <w:pPr>
+        <w:spacing w:before="0" w:after="0"/>
+      </w:pPr>
       <w:r>
+        <w:rPr>
+          <w:rFonts w:ascii="Arial" w:hAnsi="Arial" w:cs="Arial"/>
+          <w:b w:val="0"/>
+          <w:i w:val="0"/>
+          <w:color w:val="5F6368"/>
+          <w:sz w:val="16"/>
+        </w:rPr>
         <w:t>{%p if approval_history %}</w:t>
       </w:r>
     </w:p>
     <w:p>
+      <w:pPr>
+        <w:keepNext/>
+        <w:spacing w:before="320" w:after="120"/>
+        <w:pBdr>
+          <w:bottom w:val="single" w:sz="8" w:space="4" w:color="D1D5DB"/>
+        </w:pBdr>
+      </w:pPr>
       <w:r>
+        <w:rPr>
+          <w:rFonts w:ascii="Arial" w:hAnsi="Arial" w:cs="Arial"/>
+          <w:b/>
+          <w:i w:val="0"/>
+          <w:color w:val="1F3A5F"/>
+          <w:sz w:val="32"/>
+        </w:rPr>
         <w:t>Approval History</w:t>
       </w:r>
     </w:p>
+    <w:tbl>
+      <w:tblPr>
+        <w:tblW w:type="auto" w:w="0"/>
+        <w:tblLook w:firstColumn="1" w:firstRow="1" w:lastColumn="0" w:lastRow="0" w:noHBand="0" w:noVBand="1" w:val="04A0"/>
+        <w:tblLayout w:type="fixed"/>
+      </w:tblPr>
+      <w:tblGrid>
+        <w:gridCol w:w="3360"/>
+        <w:gridCol w:w="3360"/>
+        <w:gridCol w:w="3360"/>
+      </w:tblGrid>
+      <w:tr>
+        <w:tc>
+          <w:tcPr>
+            <w:tcW w:type="dxa" w:w="2800"/>
+            <w:shd w:val="clear" w:color="auto" w:fill="ECF0F1"/>
+            <w:tcBorders>
+              <w:top w:val="single" w:sz="4" w:color="BFBFBF"/>
+              <w:left w:val="single" w:sz="4" w:color="BFBFBF"/>
+              <w:bottom w:val="single" w:sz="4" w:color="BFBFBF"/>
+              <w:right w:val="single" w:sz="4" w:color="BFBFBF"/>
+            </w:tcBorders>
+            <w:vAlign w:val="center"/>
+          </w:tcPr>
+          <w:p>
+            <w:r/>
+            <w:r>
+              <w:rPr>
+                <w:rFonts w:ascii="Arial" w:hAnsi="Arial" w:cs="Arial"/>
+                <w:b/>
+                <w:i w:val="0"/>
+                <w:color w:val="000000"/>
+                <w:sz w:val="20"/>
+              </w:rPr>
+              <w:t>Timestamp</w:t>
+            </w:r>
+          </w:p>
+        </w:tc>
+        <w:tc>
+          <w:tcPr>
+            <w:tcW w:type="dxa" w:w="2600"/>
+            <w:shd w:val="clear" w:color="auto" w:fill="ECF0F1"/>
+            <w:tcBorders>
+              <w:top w:val="single" w:sz="4" w:color="BFBFBF"/>
+              <w:left w:val="single" w:sz="4" w:color="BFBFBF"/>
+              <w:bottom w:val="single" w:sz="4" w:color="BFBFBF"/>
+              <w:right w:val="single" w:sz="4" w:color="BFBFBF"/>
+            </w:tcBorders>
+            <w:vAlign w:val="center"/>
+          </w:tcPr>
+          <w:p>
+            <w:r/>
+            <w:r>
+              <w:rPr>
+                <w:rFonts w:ascii="Arial" w:hAnsi="Arial" w:cs="Arial"/>
+                <w:b/>
+                <w:i w:val="0"/>
+                <w:color w:val="000000"/>
+                <w:sz w:val="20"/>
+              </w:rPr>
+              <w:t>Action</w:t>
+            </w:r>
+          </w:p>
+        </w:tc>
+        <w:tc>
+          <w:tcPr>
+            <w:tcW w:type="dxa" w:w="4400"/>
+            <w:shd w:val="clear" w:color="auto" w:fill="ECF0F1"/>
+            <w:tcBorders>
+              <w:top w:val="single" w:sz="4" w:color="BFBFBF"/>
+              <w:left w:val="single" w:sz="4" w:color="BFBFBF"/>
+              <w:bottom w:val="single" w:sz="4" w:color="BFBFBF"/>
+              <w:right w:val="single" w:sz="4" w:color="BFBFBF"/>
+            </w:tcBorders>
+            <w:vAlign w:val="center"/>
+          </w:tcPr>
+          <w:p>
+            <w:r/>
+            <w:r>
+              <w:rPr>
+                <w:rFonts w:ascii="Arial" w:hAnsi="Arial" w:cs="Arial"/>
+                <w:b/>
+                <w:i w:val="0"/>
+                <w:color w:val="000000"/>
+                <w:sz w:val="20"/>
+              </w:rPr>
+              <w:t>Actor</w:t>
+            </w:r>
+          </w:p>
+        </w:tc>
+      </w:tr>
+      <w:tr>
+        <w:tc>
+          <w:tcPr>
+            <w:tcW w:type="dxa" w:w="2800"/>
+            <w:tcBorders>
+              <w:top w:val="single" w:sz="4" w:color="BFBFBF"/>
+              <w:left w:val="single" w:sz="4" w:color="BFBFBF"/>
+              <w:bottom w:val="single" w:sz="4" w:color="BFBFBF"/>
+              <w:right w:val="single" w:sz="4" w:color="BFBFBF"/>
+            </w:tcBorders>
+            <w:vAlign w:val="center"/>
+          </w:tcPr>
+          <w:p>
+            <w:r/>
+            <w:r>
+              <w:rPr>
+                <w:rFonts w:ascii="Arial" w:hAnsi="Arial" w:cs="Arial"/>
+                <w:b w:val="0"/>
+                <w:i w:val="0"/>
+                <w:color w:val="5F6368"/>
+                <w:sz w:val="16"/>
+              </w:rPr>
+              <w:t>{%tr for ev in approval_history %}</w:t>
+            </w:r>
+          </w:p>
+        </w:tc>
+        <w:tc>
+          <w:tcPr>
+            <w:tcW w:type="dxa" w:w="2600"/>
+            <w:tcBorders>
+              <w:top w:val="single" w:sz="4" w:color="BFBFBF"/>
+              <w:left w:val="single" w:sz="4" w:color="BFBFBF"/>
+              <w:bottom w:val="single" w:sz="4" w:color="BFBFBF"/>
+              <w:right w:val="single" w:sz="4" w:color="BFBFBF"/>
+            </w:tcBorders>
+            <w:vAlign w:val="center"/>
+          </w:tcPr>
+          <w:p>
+            <w:r/>
+            <w:r>
+              <w:rPr>
+                <w:rFonts w:ascii="Arial" w:hAnsi="Arial" w:cs="Arial"/>
+                <w:b w:val="0"/>
+                <w:i w:val="0"/>
+                <w:color w:val="000000"/>
+                <w:sz w:val="20"/>
+              </w:rPr>
+            </w:r>
+          </w:p>
+        </w:tc>
+        <w:tc>
+          <w:tcPr>
+            <w:tcW w:type="dxa" w:w="4400"/>
+            <w:tcBorders>
+              <w:top w:val="single" w:sz="4" w:color="BFBFBF"/>
+              <w:left w:val="single" w:sz="4" w:color="BFBFBF"/>
+              <w:bottom w:val="single" w:sz="4" w:color="BFBFBF"/>
+              <w:right w:val="single" w:sz="4" w:color="BFBFBF"/>
+            </w:tcBorders>
+            <w:vAlign w:val="center"/>
+          </w:tcPr>
+          <w:p>
+            <w:r/>
+            <w:r>
+              <w:rPr>
+                <w:rFonts w:ascii="Arial" w:hAnsi="Arial" w:cs="Arial"/>
+                <w:b w:val="0"/>
+                <w:i w:val="0"/>
+                <w:color w:val="000000"/>
+                <w:sz w:val="20"/>
+              </w:rPr>
+            </w:r>
+          </w:p>
+        </w:tc>
+      </w:tr>
+      <w:tr>
+        <w:tc>
+          <w:tcPr>
+            <w:tcW w:type="dxa" w:w="2800"/>
+            <w:tcBorders>
+              <w:top w:val="single" w:sz="4" w:color="BFBFBF"/>
+              <w:left w:val="single" w:sz="4" w:color="BFBFBF"/>
+              <w:bottom w:val="single" w:sz="4" w:color="BFBFBF"/>
+              <w:right w:val="single" w:sz="4" w:color="BFBFBF"/>
+            </w:tcBorders>
+            <w:vAlign w:val="center"/>
+          </w:tcPr>
+          <w:p>
+            <w:r/>
+            <w:r>
+              <w:rPr>
+                <w:rFonts w:ascii="Arial" w:hAnsi="Arial" w:cs="Arial"/>
+                <w:b w:val="0"/>
+                <w:i w:val="0"/>
+                <w:color w:val="000000"/>
+                <w:sz w:val="20"/>
+              </w:rPr>
+              <w:t>{{ ev.created_at }}</w:t>
+            </w:r>
+          </w:p>
+        </w:tc>
+        <w:tc>
+          <w:tcPr>
+            <w:tcW w:type="dxa" w:w="2600"/>
+            <w:tcBorders>
+              <w:top w:val="single" w:sz="4" w:color="BFBFBF"/>
+              <w:left w:val="single" w:sz="4" w:color="BFBFBF"/>
+              <w:bottom w:val="single" w:sz="4" w:color="BFBFBF"/>
+              <w:right w:val="single" w:sz="4" w:color="BFBFBF"/>
+            </w:tcBorders>
+            <w:vAlign w:val="center"/>
+          </w:tcPr>
+          <w:p>
+            <w:r/>
+            <w:r>
+              <w:rPr>
+                <w:rFonts w:ascii="Arial" w:hAnsi="Arial" w:cs="Arial"/>
+                <w:b w:val="0"/>
+                <w:i w:val="0"/>
+                <w:color w:val="000000"/>
+                <w:sz w:val="20"/>
+              </w:rPr>
+              <w:t>{{ ev.action }}</w:t>
+            </w:r>
+          </w:p>
+        </w:tc>
+        <w:tc>
+          <w:tcPr>
+            <w:tcW w:type="dxa" w:w="4400"/>
+            <w:tcBorders>
+              <w:top w:val="single" w:sz="4" w:color="BFBFBF"/>
+              <w:left w:val="single" w:sz="4" w:color="BFBFBF"/>
+              <w:bottom w:val="single" w:sz="4" w:color="BFBFBF"/>
+              <w:right w:val="single" w:sz="4" w:color="BFBFBF"/>
+            </w:tcBorders>
+            <w:vAlign w:val="center"/>
+          </w:tcPr>
+          <w:p>
+            <w:r/>
+            <w:r>
+              <w:rPr>
+                <w:rFonts w:ascii="Arial" w:hAnsi="Arial" w:cs="Arial"/>
+                <w:b w:val="0"/>
+                <w:i w:val="0"/>
+                <w:color w:val="000000"/>
+                <w:sz w:val="20"/>
+              </w:rPr>
+              <w:t>{{ ev.actor_name }}</w:t>
+            </w:r>
+          </w:p>
+        </w:tc>
+      </w:tr>
+      <w:tr>
+        <w:tc>
+          <w:tcPr>
+            <w:tcW w:type="dxa" w:w="2800"/>
+            <w:tcBorders>
+              <w:top w:val="single" w:sz="4" w:color="BFBFBF"/>
+              <w:left w:val="single" w:sz="4" w:color="BFBFBF"/>
+              <w:bottom w:val="single" w:sz="4" w:color="BFBFBF"/>
+              <w:right w:val="single" w:sz="4" w:color="BFBFBF"/>
+            </w:tcBorders>
+            <w:vAlign w:val="center"/>
+          </w:tcPr>
+          <w:p>
+            <w:r/>
+            <w:r>
+              <w:rPr>
+                <w:rFonts w:ascii="Arial" w:hAnsi="Arial" w:cs="Arial"/>
+                <w:b w:val="0"/>
+                <w:i w:val="0"/>
+                <w:color w:val="5F6368"/>
+                <w:sz w:val="16"/>
+              </w:rPr>
+              <w:t>{%tr endfor %}</w:t>
+            </w:r>
+          </w:p>
+        </w:tc>
+        <w:tc>
+          <w:tcPr>
+            <w:tcW w:type="dxa" w:w="2600"/>
+            <w:tcBorders>
+              <w:top w:val="single" w:sz="4" w:color="BFBFBF"/>
+              <w:left w:val="single" w:sz="4" w:color="BFBFBF"/>
+              <w:bottom w:val="single" w:sz="4" w:color="BFBFBF"/>
+              <w:right w:val="single" w:sz="4" w:color="BFBFBF"/>
+            </w:tcBorders>
+            <w:vAlign w:val="center"/>
+          </w:tcPr>
+          <w:p>
+            <w:r/>
+            <w:r>
+              <w:rPr>
+                <w:rFonts w:ascii="Arial" w:hAnsi="Arial" w:cs="Arial"/>
+                <w:b w:val="0"/>
+                <w:i w:val="0"/>
+                <w:color w:val="000000"/>
+                <w:sz w:val="20"/>
+              </w:rPr>
+            </w:r>
+          </w:p>
+        </w:tc>
+        <w:tc>
+          <w:tcPr>
+            <w:tcW w:type="dxa" w:w="4400"/>
+            <w:tcBorders>
+              <w:top w:val="single" w:sz="4" w:color="BFBFBF"/>
+              <w:left w:val="single" w:sz="4" w:color="BFBFBF"/>
+              <w:bottom w:val="single" w:sz="4" w:color="BFBFBF"/>
+              <w:right w:val="single" w:sz="4" w:color="BFBFBF"/>
+            </w:tcBorders>
+            <w:vAlign w:val="center"/>
+          </w:tcPr>
+          <w:p>
+            <w:r/>
+            <w:r>
+              <w:rPr>
+                <w:rFonts w:ascii="Arial" w:hAnsi="Arial" w:cs="Arial"/>
+                <w:b w:val="0"/>
+                <w:i w:val="0"/>
+                <w:color w:val="000000"/>
+                <w:sz w:val="20"/>
+              </w:rPr>
+            </w:r>
+          </w:p>
+        </w:tc>
+      </w:tr>
+    </w:tbl>
     <w:p>
+      <w:pPr>
+        <w:spacing w:before="0" w:after="0"/>
+      </w:pPr>
       <w:r>
-        <w:t>{%p for ev in approval_history %}</w:t>
-      </w:r>
-    </w:p>
-    <w:p>
-      <w:r>
-        <w:t>{{ ev.created_at }} — {{ ev.action }} by {{ ev.actor_name }}</w:t>
-      </w:r>
-    </w:p>
-    <w:p>
-      <w:r>
-        <w:t>{%p endfor %}</w:t>
-      </w:r>
-    </w:p>
-    <w:p>
-      <w:r>
+        <w:rPr>
+          <w:rFonts w:ascii="Arial" w:hAnsi="Arial" w:cs="Arial"/>
+          <w:b w:val="0"/>
+          <w:i w:val="0"/>
+          <w:color w:val="5F6368"/>
+          <w:sz w:val="16"/>
+        </w:rPr>
         <w:t>{%p endif %}</w:t>
       </w:r>
     </w:p>
     <w:sectPr>
-      <w:headerReference w:type="default" r:id="rId9"/>
-      <w:footerReference w:type="default" r:id="rId10"/>
       <w:pgSz w:w="12240" w:h="15840"/>
-      <w:pgMar w:top="1440" w:right="1440" w:bottom="1440" w:left="1440" w:header="720" w:footer="720" w:gutter="0"/>
+      <w:pgMar w:top="1080" w:right="1080" w:bottom="1080" w:left="1080" w:header="720" w:footer="720" w:gutter="0"/>
       <w:cols w:space="720"/>
       <w:docGrid w:linePitch="360"/>
     </w:sectPr>
   </w:body>
 </w:document>
-</file>
-
-<file path=word/footer1.xml><?xml version="1.0" encoding="utf-8"?>
-<w:ftr xmlns:m="http://schemas.openxmlformats.org/officeDocument/2006/math" xmlns:mc="http://schemas.openxmlformats.org/markup-compatibility/2006" xmlns:mo="http://schemas.microsoft.com/office/mac/office/2008/main" xmlns:mv="urn:schemas-microsoft-com:mac:vml" xmlns:o="urn:schemas-microsoft-com:office:office" xmlns:r="http://schemas.openxmlformats.org/officeDocument/2006/relationships" xmlns:v="urn:schemas-microsoft-com:vml" xmlns:w10="urn:schemas-microsoft-com:office:word" xmlns:w14="http://schemas.microsoft.com/office/word/2010/wordml" xmlns:w="http://schemas.openxmlformats.org/wordprocessingml/2006/main" xmlns:wne="http://schemas.microsoft.com/office/word/2006/wordml" xmlns:wp14="http://schemas.microsoft.com/office/word/2010/wordprocessingDrawing" xmlns:wp="http://schemas.openxmlformats.org/drawingml/2006/wordprocessingDrawing" xmlns:wpc="http://schemas.microsoft.com/office/word/2010/wordprocessingCanvas" xmlns:wpg="http://schemas.microsoft.com/office/word/2010/wordprocessingGroup" xmlns:wpi="http://schemas.microsoft.com/office/word/2010/wordprocessingInk" xmlns:wps="http://schemas.microsoft.com/office/word/2010/wordprocessingShape" mc:Ignorable="w14 wp14">
-  <w:p>
-    <w:pPr>
-      <w:pStyle w:val="Footer"/>
-      <w:jc w:val="center"/>
-    </w:pPr>
-    <w:r>
-      <w:rPr>
-        <w:color w:val="969696"/>
-        <w:sz w:val="16"/>
-      </w:rPr>
-      <w:t xml:space="preserve">Page </w:t>
-      <w:fldChar w:fldCharType="begin"/>
-      <w:instrText> PAGE </w:instrText>
-      <w:fldChar w:fldCharType="end"/>
-    </w:r>
-    <w:r>
-      <w:rPr>
-        <w:color w:val="969696"/>
-        <w:sz w:val="16"/>
-      </w:rPr>
-      <w:t xml:space="preserve"> / </w:t>
-      <w:fldChar w:fldCharType="begin"/>
-      <w:instrText> NUMPAGES </w:instrText>
-      <w:fldChar w:fldCharType="end"/>
-    </w:r>
-  </w:p>
-</w:ftr>
-</file>
-
-<file path=word/header1.xml><?xml version="1.0" encoding="utf-8"?>
-<w:hdr xmlns:m="http://schemas.openxmlformats.org/officeDocument/2006/math" xmlns:mc="http://schemas.openxmlformats.org/markup-compatibility/2006" xmlns:mo="http://schemas.microsoft.com/office/mac/office/2008/main" xmlns:mv="urn:schemas-microsoft-com:mac:vml" xmlns:o="urn:schemas-microsoft-com:office:office" xmlns:r="http://schemas.openxmlformats.org/officeDocument/2006/relationships" xmlns:v="urn:schemas-microsoft-com:vml" xmlns:w10="urn:schemas-microsoft-com:office:word" xmlns:w14="http://schemas.microsoft.com/office/word/2010/wordml" xmlns:w="http://schemas.openxmlformats.org/wordprocessingml/2006/main" xmlns:wne="http://schemas.microsoft.com/office/word/2006/wordml" xmlns:wp14="http://schemas.microsoft.com/office/word/2010/wordprocessingDrawing" xmlns:wp="http://schemas.openxmlformats.org/drawingml/2006/wordprocessingDrawing" xmlns:wpc="http://schemas.microsoft.com/office/word/2010/wordprocessingCanvas" xmlns:wpg="http://schemas.microsoft.com/office/word/2010/wordprocessingGroup" xmlns:wpi="http://schemas.microsoft.com/office/word/2010/wordprocessingInk" xmlns:wps="http://schemas.microsoft.com/office/word/2010/wordprocessingShape" mc:Ignorable="w14 wp14">
-  <w:p>
-    <w:pPr>
-      <w:pStyle w:val="Header"/>
-      <w:tabs>
-        <w:tab w:pos="9360" w:val="right"/>
-      </w:tabs>
-      <w:jc w:val="left"/>
-    </w:pPr>
-    <w:r>
-      <w:rPr>
-        <w:i/>
-        <w:color w:val="787878"/>
-        <w:sz w:val="18"/>
-      </w:rPr>
-      <w:t>STANDARD OPERATING PROCEDURE</w:t>
-      <w:tab/>
-    </w:r>
-    <w:r>
-      <w:rPr>
-        <w:i/>
-        <w:color w:val="787878"/>
-        <w:sz w:val="18"/>
-      </w:rPr>
-      <w:t>{% if version_number %}v{{ version_number }}{% endif %}{% if version_number and created_at %}  |  {% endif %}{{ created_at }}</w:t>
-    </w:r>
-  </w:p>
-</w:hdr>
 </file>
 
 <file path=word/numbering.xml><?xml version="1.0" encoding="utf-8"?>
@@ -749,6 +2909,11 @@
     <w:name w:val="Normal"/>
     <w:qFormat/>
     <w:rsid w:val="00FC693F"/>
+    <w:rPr>
+      <w:rFonts w:ascii="Arial" w:hAnsi="Arial"/>
+      <w:color w:val="000000"/>
+      <w:sz w:val="20"/>
+    </w:rPr>
   </w:style>
   <w:style w:type="paragraph" w:styleId="Header">
     <w:name w:val="header"/>

</xml_diff>

<commit_message>
style(sop_template): darker heading color + padded table headers
- Heading color: 1F3A5F → 2C3E50 (charcoal-navy, less saturated blue)
- Table-header rows now use w:tcMar to add ~7pt top/bottom padding
  (matches the more generous header padding of the source SOP example)
- Body rows get a smaller ~5pt margin for breathing room

Co-Authored-By: Claude Opus 4.7 <noreply@anthropic.com>
</commit_message>
<xml_diff>
--- a/backend/app/services/documents/templates/sop_default.docx
+++ b/backend/app/services/documents/templates/sop_default.docx
@@ -86,6 +86,12 @@
               <w:bottom w:val="single" w:sz="4" w:color="BFBFBF"/>
               <w:right w:val="single" w:sz="4" w:color="BFBFBF"/>
             </w:tcBorders>
+            <w:tcMar>
+              <w:top w:w="100" w:type="dxa"/>
+              <w:bottom w:w="100" w:type="dxa"/>
+              <w:left w:w="100" w:type="dxa"/>
+              <w:right w:w="100" w:type="dxa"/>
+            </w:tcMar>
             <w:vAlign w:val="center"/>
           </w:tcPr>
           <w:p>
@@ -111,6 +117,12 @@
               <w:bottom w:val="single" w:sz="4" w:color="BFBFBF"/>
               <w:right w:val="single" w:sz="4" w:color="BFBFBF"/>
             </w:tcBorders>
+            <w:tcMar>
+              <w:top w:w="100" w:type="dxa"/>
+              <w:bottom w:w="100" w:type="dxa"/>
+              <w:left w:w="100" w:type="dxa"/>
+              <w:right w:w="100" w:type="dxa"/>
+            </w:tcMar>
             <w:vAlign w:val="center"/>
           </w:tcPr>
           <w:p>
@@ -137,6 +149,12 @@
               <w:bottom w:val="single" w:sz="4" w:color="BFBFBF"/>
               <w:right w:val="single" w:sz="4" w:color="BFBFBF"/>
             </w:tcBorders>
+            <w:tcMar>
+              <w:top w:w="100" w:type="dxa"/>
+              <w:bottom w:w="100" w:type="dxa"/>
+              <w:left w:w="100" w:type="dxa"/>
+              <w:right w:w="100" w:type="dxa"/>
+            </w:tcMar>
             <w:vAlign w:val="center"/>
           </w:tcPr>
           <w:p>
@@ -162,6 +180,12 @@
               <w:bottom w:val="single" w:sz="4" w:color="BFBFBF"/>
               <w:right w:val="single" w:sz="4" w:color="BFBFBF"/>
             </w:tcBorders>
+            <w:tcMar>
+              <w:top w:w="100" w:type="dxa"/>
+              <w:bottom w:w="100" w:type="dxa"/>
+              <w:left w:w="100" w:type="dxa"/>
+              <w:right w:w="100" w:type="dxa"/>
+            </w:tcMar>
             <w:vAlign w:val="center"/>
           </w:tcPr>
           <w:p>
@@ -190,6 +214,12 @@
               <w:bottom w:val="single" w:sz="4" w:color="BFBFBF"/>
               <w:right w:val="single" w:sz="4" w:color="BFBFBF"/>
             </w:tcBorders>
+            <w:tcMar>
+              <w:top w:w="100" w:type="dxa"/>
+              <w:bottom w:w="100" w:type="dxa"/>
+              <w:left w:w="100" w:type="dxa"/>
+              <w:right w:w="100" w:type="dxa"/>
+            </w:tcMar>
             <w:vAlign w:val="center"/>
           </w:tcPr>
           <w:p>
@@ -216,6 +246,12 @@
               <w:bottom w:val="single" w:sz="4" w:color="BFBFBF"/>
               <w:right w:val="single" w:sz="4" w:color="BFBFBF"/>
             </w:tcBorders>
+            <w:tcMar>
+              <w:top w:w="100" w:type="dxa"/>
+              <w:bottom w:w="100" w:type="dxa"/>
+              <w:left w:w="100" w:type="dxa"/>
+              <w:right w:w="100" w:type="dxa"/>
+            </w:tcMar>
             <w:vAlign w:val="center"/>
           </w:tcPr>
           <w:p>
@@ -244,6 +280,12 @@
               <w:bottom w:val="single" w:sz="4" w:color="BFBFBF"/>
               <w:right w:val="single" w:sz="4" w:color="BFBFBF"/>
             </w:tcBorders>
+            <w:tcMar>
+              <w:top w:w="100" w:type="dxa"/>
+              <w:bottom w:w="100" w:type="dxa"/>
+              <w:left w:w="100" w:type="dxa"/>
+              <w:right w:w="100" w:type="dxa"/>
+            </w:tcMar>
             <w:vAlign w:val="center"/>
           </w:tcPr>
           <w:p>
@@ -270,6 +312,12 @@
               <w:bottom w:val="single" w:sz="4" w:color="BFBFBF"/>
               <w:right w:val="single" w:sz="4" w:color="BFBFBF"/>
             </w:tcBorders>
+            <w:tcMar>
+              <w:top w:w="100" w:type="dxa"/>
+              <w:bottom w:w="100" w:type="dxa"/>
+              <w:left w:w="100" w:type="dxa"/>
+              <w:right w:w="100" w:type="dxa"/>
+            </w:tcMar>
             <w:vAlign w:val="center"/>
           </w:tcPr>
           <w:p>
@@ -322,7 +370,7 @@
           <w:rFonts w:ascii="Arial" w:hAnsi="Arial" w:cs="Arial"/>
           <w:b/>
           <w:i w:val="0"/>
-          <w:color w:val="1F3A5F"/>
+          <w:color w:val="2C3E50"/>
           <w:sz w:val="32"/>
         </w:rPr>
         <w:t>1.0 Purpose</w:t>
@@ -356,7 +404,7 @@
           <w:rFonts w:ascii="Arial" w:hAnsi="Arial" w:cs="Arial"/>
           <w:b/>
           <w:i w:val="0"/>
-          <w:color w:val="1F3A5F"/>
+          <w:color w:val="2C3E50"/>
           <w:sz w:val="32"/>
         </w:rPr>
         <w:t>2.0 Scope</w:t>
@@ -390,7 +438,7 @@
           <w:rFonts w:ascii="Arial" w:hAnsi="Arial" w:cs="Arial"/>
           <w:b/>
           <w:i w:val="0"/>
-          <w:color w:val="1F3A5F"/>
+          <w:color w:val="2C3E50"/>
           <w:sz w:val="32"/>
         </w:rPr>
         <w:t>3.0 Procedure: {{ protocol_name }}</w:t>
@@ -491,7 +539,7 @@
           <w:rFonts w:ascii="Arial" w:hAnsi="Arial" w:cs="Arial"/>
           <w:b/>
           <w:i w:val="0"/>
-          <w:color w:val="1F3A5F"/>
+          <w:color w:val="2C3E50"/>
           <w:sz w:val="26"/>
         </w:rPr>
         <w:t>3.{{ loop.index }}  {{ tp.name }}</w:t>
@@ -673,6 +721,12 @@
               <w:bottom w:val="single" w:sz="4" w:color="BFBFBF"/>
               <w:right w:val="single" w:sz="4" w:color="BFBFBF"/>
             </w:tcBorders>
+            <w:tcMar>
+              <w:top w:w="140" w:type="dxa"/>
+              <w:bottom w:w="140" w:type="dxa"/>
+              <w:left w:w="100" w:type="dxa"/>
+              <w:right w:w="100" w:type="dxa"/>
+            </w:tcMar>
             <w:vAlign w:val="center"/>
           </w:tcPr>
           <w:p>
@@ -702,6 +756,12 @@
               <w:bottom w:val="single" w:sz="4" w:color="BFBFBF"/>
               <w:right w:val="single" w:sz="4" w:color="BFBFBF"/>
             </w:tcBorders>
+            <w:tcMar>
+              <w:top w:w="140" w:type="dxa"/>
+              <w:bottom w:w="140" w:type="dxa"/>
+              <w:left w:w="100" w:type="dxa"/>
+              <w:right w:w="100" w:type="dxa"/>
+            </w:tcMar>
             <w:vAlign w:val="center"/>
           </w:tcPr>
           <w:p>
@@ -731,6 +791,12 @@
               <w:bottom w:val="single" w:sz="4" w:color="BFBFBF"/>
               <w:right w:val="single" w:sz="4" w:color="BFBFBF"/>
             </w:tcBorders>
+            <w:tcMar>
+              <w:top w:w="140" w:type="dxa"/>
+              <w:bottom w:w="140" w:type="dxa"/>
+              <w:left w:w="100" w:type="dxa"/>
+              <w:right w:w="100" w:type="dxa"/>
+            </w:tcMar>
             <w:vAlign w:val="center"/>
           </w:tcPr>
           <w:p>
@@ -761,6 +827,12 @@
               <w:bottom w:val="single" w:sz="4" w:color="BFBFBF"/>
               <w:right w:val="single" w:sz="4" w:color="BFBFBF"/>
             </w:tcBorders>
+            <w:tcMar>
+              <w:top w:w="100" w:type="dxa"/>
+              <w:bottom w:w="100" w:type="dxa"/>
+              <w:left w:w="100" w:type="dxa"/>
+              <w:right w:w="100" w:type="dxa"/>
+            </w:tcMar>
             <w:vAlign w:val="center"/>
           </w:tcPr>
           <w:p>
@@ -786,6 +858,12 @@
               <w:bottom w:val="single" w:sz="4" w:color="BFBFBF"/>
               <w:right w:val="single" w:sz="4" w:color="BFBFBF"/>
             </w:tcBorders>
+            <w:tcMar>
+              <w:top w:w="100" w:type="dxa"/>
+              <w:bottom w:w="100" w:type="dxa"/>
+              <w:left w:w="100" w:type="dxa"/>
+              <w:right w:w="100" w:type="dxa"/>
+            </w:tcMar>
             <w:vAlign w:val="center"/>
           </w:tcPr>
           <w:p>
@@ -810,6 +888,12 @@
               <w:bottom w:val="single" w:sz="4" w:color="BFBFBF"/>
               <w:right w:val="single" w:sz="4" w:color="BFBFBF"/>
             </w:tcBorders>
+            <w:tcMar>
+              <w:top w:w="100" w:type="dxa"/>
+              <w:bottom w:w="100" w:type="dxa"/>
+              <w:left w:w="100" w:type="dxa"/>
+              <w:right w:w="100" w:type="dxa"/>
+            </w:tcMar>
             <w:vAlign w:val="center"/>
           </w:tcPr>
           <w:p>
@@ -836,6 +920,12 @@
               <w:bottom w:val="single" w:sz="4" w:color="BFBFBF"/>
               <w:right w:val="single" w:sz="4" w:color="BFBFBF"/>
             </w:tcBorders>
+            <w:tcMar>
+              <w:top w:w="100" w:type="dxa"/>
+              <w:bottom w:w="100" w:type="dxa"/>
+              <w:left w:w="100" w:type="dxa"/>
+              <w:right w:w="100" w:type="dxa"/>
+            </w:tcMar>
             <w:vAlign w:val="center"/>
           </w:tcPr>
           <w:p>
@@ -864,6 +954,12 @@
               <w:bottom w:val="single" w:sz="4" w:color="BFBFBF"/>
               <w:right w:val="single" w:sz="4" w:color="BFBFBF"/>
             </w:tcBorders>
+            <w:tcMar>
+              <w:top w:w="100" w:type="dxa"/>
+              <w:bottom w:w="100" w:type="dxa"/>
+              <w:left w:w="100" w:type="dxa"/>
+              <w:right w:w="100" w:type="dxa"/>
+            </w:tcMar>
             <w:vAlign w:val="center"/>
           </w:tcPr>
           <w:p>
@@ -889,6 +985,12 @@
               <w:bottom w:val="single" w:sz="4" w:color="BFBFBF"/>
               <w:right w:val="single" w:sz="4" w:color="BFBFBF"/>
             </w:tcBorders>
+            <w:tcMar>
+              <w:top w:w="100" w:type="dxa"/>
+              <w:bottom w:w="100" w:type="dxa"/>
+              <w:left w:w="100" w:type="dxa"/>
+              <w:right w:w="100" w:type="dxa"/>
+            </w:tcMar>
             <w:vAlign w:val="center"/>
           </w:tcPr>
           <w:p>
@@ -919,6 +1021,12 @@
               <w:bottom w:val="single" w:sz="4" w:color="BFBFBF"/>
               <w:right w:val="single" w:sz="4" w:color="BFBFBF"/>
             </w:tcBorders>
+            <w:tcMar>
+              <w:top w:w="100" w:type="dxa"/>
+              <w:bottom w:w="100" w:type="dxa"/>
+              <w:left w:w="100" w:type="dxa"/>
+              <w:right w:w="100" w:type="dxa"/>
+            </w:tcMar>
             <w:vAlign w:val="center"/>
           </w:tcPr>
           <w:p>
@@ -944,6 +1052,12 @@
               <w:bottom w:val="single" w:sz="4" w:color="BFBFBF"/>
               <w:right w:val="single" w:sz="4" w:color="BFBFBF"/>
             </w:tcBorders>
+            <w:tcMar>
+              <w:top w:w="100" w:type="dxa"/>
+              <w:bottom w:w="100" w:type="dxa"/>
+              <w:left w:w="100" w:type="dxa"/>
+              <w:right w:w="100" w:type="dxa"/>
+            </w:tcMar>
             <w:vAlign w:val="center"/>
           </w:tcPr>
           <w:p>
@@ -968,6 +1082,12 @@
               <w:bottom w:val="single" w:sz="4" w:color="BFBFBF"/>
               <w:right w:val="single" w:sz="4" w:color="BFBFBF"/>
             </w:tcBorders>
+            <w:tcMar>
+              <w:top w:w="100" w:type="dxa"/>
+              <w:bottom w:w="100" w:type="dxa"/>
+              <w:left w:w="100" w:type="dxa"/>
+              <w:right w:w="100" w:type="dxa"/>
+            </w:tcMar>
             <w:vAlign w:val="center"/>
           </w:tcPr>
           <w:p>
@@ -1055,7 +1175,7 @@
           <w:rFonts w:ascii="Arial" w:hAnsi="Arial" w:cs="Arial"/>
           <w:b/>
           <w:i w:val="0"/>
-          <w:color w:val="1F3A5F"/>
+          <w:color w:val="2C3E50"/>
           <w:sz w:val="26"/>
         </w:rPr>
         <w:t>3.{{ loop.index }}  {{ role.process_name or role.name }}</w:t>
@@ -1084,6 +1204,12 @@
               <w:bottom w:val="single" w:sz="4" w:color="BFBFBF"/>
               <w:right w:val="single" w:sz="4" w:color="BFBFBF"/>
             </w:tcBorders>
+            <w:tcMar>
+              <w:top w:w="140" w:type="dxa"/>
+              <w:bottom w:w="140" w:type="dxa"/>
+              <w:left w:w="100" w:type="dxa"/>
+              <w:right w:w="100" w:type="dxa"/>
+            </w:tcMar>
             <w:vAlign w:val="center"/>
           </w:tcPr>
           <w:p>
@@ -1113,6 +1239,12 @@
               <w:bottom w:val="single" w:sz="4" w:color="BFBFBF"/>
               <w:right w:val="single" w:sz="4" w:color="BFBFBF"/>
             </w:tcBorders>
+            <w:tcMar>
+              <w:top w:w="140" w:type="dxa"/>
+              <w:bottom w:w="140" w:type="dxa"/>
+              <w:left w:w="100" w:type="dxa"/>
+              <w:right w:w="100" w:type="dxa"/>
+            </w:tcMar>
             <w:vAlign w:val="center"/>
           </w:tcPr>
           <w:p>
@@ -1142,6 +1274,12 @@
               <w:bottom w:val="single" w:sz="4" w:color="BFBFBF"/>
               <w:right w:val="single" w:sz="4" w:color="BFBFBF"/>
             </w:tcBorders>
+            <w:tcMar>
+              <w:top w:w="140" w:type="dxa"/>
+              <w:bottom w:w="140" w:type="dxa"/>
+              <w:left w:w="100" w:type="dxa"/>
+              <w:right w:w="100" w:type="dxa"/>
+            </w:tcMar>
             <w:vAlign w:val="center"/>
           </w:tcPr>
           <w:p>
@@ -1171,6 +1309,12 @@
               <w:bottom w:val="single" w:sz="4" w:color="BFBFBF"/>
               <w:right w:val="single" w:sz="4" w:color="BFBFBF"/>
             </w:tcBorders>
+            <w:tcMar>
+              <w:top w:w="140" w:type="dxa"/>
+              <w:bottom w:w="140" w:type="dxa"/>
+              <w:left w:w="100" w:type="dxa"/>
+              <w:right w:w="100" w:type="dxa"/>
+            </w:tcMar>
             <w:vAlign w:val="center"/>
           </w:tcPr>
           <w:p>
@@ -1201,6 +1345,12 @@
               <w:bottom w:val="single" w:sz="4" w:color="BFBFBF"/>
               <w:right w:val="single" w:sz="4" w:color="BFBFBF"/>
             </w:tcBorders>
+            <w:tcMar>
+              <w:top w:w="100" w:type="dxa"/>
+              <w:bottom w:w="100" w:type="dxa"/>
+              <w:left w:w="100" w:type="dxa"/>
+              <w:right w:w="100" w:type="dxa"/>
+            </w:tcMar>
             <w:vAlign w:val="center"/>
           </w:tcPr>
           <w:p>
@@ -1226,6 +1376,12 @@
               <w:bottom w:val="single" w:sz="4" w:color="BFBFBF"/>
               <w:right w:val="single" w:sz="4" w:color="BFBFBF"/>
             </w:tcBorders>
+            <w:tcMar>
+              <w:top w:w="100" w:type="dxa"/>
+              <w:bottom w:w="100" w:type="dxa"/>
+              <w:left w:w="100" w:type="dxa"/>
+              <w:right w:w="100" w:type="dxa"/>
+            </w:tcMar>
             <w:vAlign w:val="center"/>
           </w:tcPr>
           <w:p>
@@ -1250,6 +1406,12 @@
               <w:bottom w:val="single" w:sz="4" w:color="BFBFBF"/>
               <w:right w:val="single" w:sz="4" w:color="BFBFBF"/>
             </w:tcBorders>
+            <w:tcMar>
+              <w:top w:w="100" w:type="dxa"/>
+              <w:bottom w:w="100" w:type="dxa"/>
+              <w:left w:w="100" w:type="dxa"/>
+              <w:right w:w="100" w:type="dxa"/>
+            </w:tcMar>
             <w:vAlign w:val="center"/>
           </w:tcPr>
           <w:p>
@@ -1274,6 +1436,12 @@
               <w:bottom w:val="single" w:sz="4" w:color="BFBFBF"/>
               <w:right w:val="single" w:sz="4" w:color="BFBFBF"/>
             </w:tcBorders>
+            <w:tcMar>
+              <w:top w:w="100" w:type="dxa"/>
+              <w:bottom w:w="100" w:type="dxa"/>
+              <w:left w:w="100" w:type="dxa"/>
+              <w:right w:w="100" w:type="dxa"/>
+            </w:tcMar>
             <w:vAlign w:val="center"/>
           </w:tcPr>
           <w:p>
@@ -1300,6 +1468,12 @@
               <w:bottom w:val="single" w:sz="4" w:color="BFBFBF"/>
               <w:right w:val="single" w:sz="4" w:color="BFBFBF"/>
             </w:tcBorders>
+            <w:tcMar>
+              <w:top w:w="100" w:type="dxa"/>
+              <w:bottom w:w="100" w:type="dxa"/>
+              <w:left w:w="100" w:type="dxa"/>
+              <w:right w:w="100" w:type="dxa"/>
+            </w:tcMar>
             <w:vAlign w:val="center"/>
           </w:tcPr>
           <w:p>
@@ -1328,6 +1502,12 @@
               <w:bottom w:val="single" w:sz="4" w:color="BFBFBF"/>
               <w:right w:val="single" w:sz="4" w:color="BFBFBF"/>
             </w:tcBorders>
+            <w:tcMar>
+              <w:top w:w="100" w:type="dxa"/>
+              <w:bottom w:w="100" w:type="dxa"/>
+              <w:left w:w="100" w:type="dxa"/>
+              <w:right w:w="100" w:type="dxa"/>
+            </w:tcMar>
             <w:vAlign w:val="center"/>
           </w:tcPr>
           <w:p>
@@ -1353,6 +1533,12 @@
               <w:bottom w:val="single" w:sz="4" w:color="BFBFBF"/>
               <w:right w:val="single" w:sz="4" w:color="BFBFBF"/>
             </w:tcBorders>
+            <w:tcMar>
+              <w:top w:w="100" w:type="dxa"/>
+              <w:bottom w:w="100" w:type="dxa"/>
+              <w:left w:w="100" w:type="dxa"/>
+              <w:right w:w="100" w:type="dxa"/>
+            </w:tcMar>
             <w:vAlign w:val="center"/>
           </w:tcPr>
           <w:p>
@@ -1378,6 +1564,12 @@
               <w:bottom w:val="single" w:sz="4" w:color="BFBFBF"/>
               <w:right w:val="single" w:sz="4" w:color="BFBFBF"/>
             </w:tcBorders>
+            <w:tcMar>
+              <w:top w:w="100" w:type="dxa"/>
+              <w:bottom w:w="100" w:type="dxa"/>
+              <w:left w:w="100" w:type="dxa"/>
+              <w:right w:w="100" w:type="dxa"/>
+            </w:tcMar>
             <w:vAlign w:val="center"/>
           </w:tcPr>
           <w:p>
@@ -1408,6 +1600,12 @@
               <w:bottom w:val="single" w:sz="4" w:color="BFBFBF"/>
               <w:right w:val="single" w:sz="4" w:color="BFBFBF"/>
             </w:tcBorders>
+            <w:tcMar>
+              <w:top w:w="100" w:type="dxa"/>
+              <w:bottom w:w="100" w:type="dxa"/>
+              <w:left w:w="100" w:type="dxa"/>
+              <w:right w:w="100" w:type="dxa"/>
+            </w:tcMar>
             <w:vAlign w:val="center"/>
           </w:tcPr>
           <w:p>
@@ -1433,6 +1631,12 @@
               <w:bottom w:val="single" w:sz="4" w:color="BFBFBF"/>
               <w:right w:val="single" w:sz="4" w:color="BFBFBF"/>
             </w:tcBorders>
+            <w:tcMar>
+              <w:top w:w="100" w:type="dxa"/>
+              <w:bottom w:w="100" w:type="dxa"/>
+              <w:left w:w="100" w:type="dxa"/>
+              <w:right w:w="100" w:type="dxa"/>
+            </w:tcMar>
             <w:vAlign w:val="center"/>
           </w:tcPr>
           <w:p>
@@ -1457,6 +1661,12 @@
               <w:bottom w:val="single" w:sz="4" w:color="BFBFBF"/>
               <w:right w:val="single" w:sz="4" w:color="BFBFBF"/>
             </w:tcBorders>
+            <w:tcMar>
+              <w:top w:w="100" w:type="dxa"/>
+              <w:bottom w:w="100" w:type="dxa"/>
+              <w:left w:w="100" w:type="dxa"/>
+              <w:right w:w="100" w:type="dxa"/>
+            </w:tcMar>
             <w:vAlign w:val="center"/>
           </w:tcPr>
           <w:p>
@@ -1481,6 +1691,12 @@
               <w:bottom w:val="single" w:sz="4" w:color="BFBFBF"/>
               <w:right w:val="single" w:sz="4" w:color="BFBFBF"/>
             </w:tcBorders>
+            <w:tcMar>
+              <w:top w:w="100" w:type="dxa"/>
+              <w:bottom w:w="100" w:type="dxa"/>
+              <w:left w:w="100" w:type="dxa"/>
+              <w:right w:w="100" w:type="dxa"/>
+            </w:tcMar>
             <w:vAlign w:val="center"/>
           </w:tcPr>
           <w:p>
@@ -1551,6 +1767,12 @@
               <w:bottom w:val="single" w:sz="4" w:color="BFBFBF"/>
               <w:right w:val="single" w:sz="4" w:color="BFBFBF"/>
             </w:tcBorders>
+            <w:tcMar>
+              <w:top w:w="140" w:type="dxa"/>
+              <w:bottom w:w="140" w:type="dxa"/>
+              <w:left w:w="100" w:type="dxa"/>
+              <w:right w:w="100" w:type="dxa"/>
+            </w:tcMar>
             <w:vAlign w:val="center"/>
           </w:tcPr>
           <w:p>
@@ -1580,6 +1802,12 @@
               <w:bottom w:val="single" w:sz="4" w:color="BFBFBF"/>
               <w:right w:val="single" w:sz="4" w:color="BFBFBF"/>
             </w:tcBorders>
+            <w:tcMar>
+              <w:top w:w="140" w:type="dxa"/>
+              <w:bottom w:w="140" w:type="dxa"/>
+              <w:left w:w="100" w:type="dxa"/>
+              <w:right w:w="100" w:type="dxa"/>
+            </w:tcMar>
             <w:vAlign w:val="center"/>
           </w:tcPr>
           <w:p>
@@ -1609,6 +1837,12 @@
               <w:bottom w:val="single" w:sz="4" w:color="BFBFBF"/>
               <w:right w:val="single" w:sz="4" w:color="BFBFBF"/>
             </w:tcBorders>
+            <w:tcMar>
+              <w:top w:w="140" w:type="dxa"/>
+              <w:bottom w:w="140" w:type="dxa"/>
+              <w:left w:w="100" w:type="dxa"/>
+              <w:right w:w="100" w:type="dxa"/>
+            </w:tcMar>
             <w:vAlign w:val="center"/>
           </w:tcPr>
           <w:p>
@@ -1638,6 +1872,12 @@
               <w:bottom w:val="single" w:sz="4" w:color="BFBFBF"/>
               <w:right w:val="single" w:sz="4" w:color="BFBFBF"/>
             </w:tcBorders>
+            <w:tcMar>
+              <w:top w:w="140" w:type="dxa"/>
+              <w:bottom w:w="140" w:type="dxa"/>
+              <w:left w:w="100" w:type="dxa"/>
+              <w:right w:w="100" w:type="dxa"/>
+            </w:tcMar>
             <w:vAlign w:val="center"/>
           </w:tcPr>
           <w:p>
@@ -1668,6 +1908,12 @@
               <w:bottom w:val="single" w:sz="4" w:color="BFBFBF"/>
               <w:right w:val="single" w:sz="4" w:color="BFBFBF"/>
             </w:tcBorders>
+            <w:tcMar>
+              <w:top w:w="100" w:type="dxa"/>
+              <w:bottom w:w="100" w:type="dxa"/>
+              <w:left w:w="100" w:type="dxa"/>
+              <w:right w:w="100" w:type="dxa"/>
+            </w:tcMar>
             <w:vAlign w:val="center"/>
           </w:tcPr>
           <w:p>
@@ -1693,6 +1939,12 @@
               <w:bottom w:val="single" w:sz="4" w:color="BFBFBF"/>
               <w:right w:val="single" w:sz="4" w:color="BFBFBF"/>
             </w:tcBorders>
+            <w:tcMar>
+              <w:top w:w="100" w:type="dxa"/>
+              <w:bottom w:w="100" w:type="dxa"/>
+              <w:left w:w="100" w:type="dxa"/>
+              <w:right w:w="100" w:type="dxa"/>
+            </w:tcMar>
             <w:vAlign w:val="center"/>
           </w:tcPr>
           <w:p>
@@ -1717,6 +1969,12 @@
               <w:bottom w:val="single" w:sz="4" w:color="BFBFBF"/>
               <w:right w:val="single" w:sz="4" w:color="BFBFBF"/>
             </w:tcBorders>
+            <w:tcMar>
+              <w:top w:w="100" w:type="dxa"/>
+              <w:bottom w:w="100" w:type="dxa"/>
+              <w:left w:w="100" w:type="dxa"/>
+              <w:right w:w="100" w:type="dxa"/>
+            </w:tcMar>
             <w:vAlign w:val="center"/>
           </w:tcPr>
           <w:p>
@@ -1741,6 +1999,12 @@
               <w:bottom w:val="single" w:sz="4" w:color="BFBFBF"/>
               <w:right w:val="single" w:sz="4" w:color="BFBFBF"/>
             </w:tcBorders>
+            <w:tcMar>
+              <w:top w:w="100" w:type="dxa"/>
+              <w:bottom w:w="100" w:type="dxa"/>
+              <w:left w:w="100" w:type="dxa"/>
+              <w:right w:w="100" w:type="dxa"/>
+            </w:tcMar>
             <w:vAlign w:val="center"/>
           </w:tcPr>
           <w:p>
@@ -1767,6 +2031,12 @@
               <w:bottom w:val="single" w:sz="4" w:color="BFBFBF"/>
               <w:right w:val="single" w:sz="4" w:color="BFBFBF"/>
             </w:tcBorders>
+            <w:tcMar>
+              <w:top w:w="100" w:type="dxa"/>
+              <w:bottom w:w="100" w:type="dxa"/>
+              <w:left w:w="100" w:type="dxa"/>
+              <w:right w:w="100" w:type="dxa"/>
+            </w:tcMar>
             <w:vAlign w:val="center"/>
           </w:tcPr>
           <w:p>
@@ -1795,6 +2065,12 @@
               <w:bottom w:val="single" w:sz="4" w:color="BFBFBF"/>
               <w:right w:val="single" w:sz="4" w:color="BFBFBF"/>
             </w:tcBorders>
+            <w:tcMar>
+              <w:top w:w="100" w:type="dxa"/>
+              <w:bottom w:w="100" w:type="dxa"/>
+              <w:left w:w="100" w:type="dxa"/>
+              <w:right w:w="100" w:type="dxa"/>
+            </w:tcMar>
             <w:vAlign w:val="center"/>
           </w:tcPr>
           <w:p>
@@ -1820,6 +2096,12 @@
               <w:bottom w:val="single" w:sz="4" w:color="BFBFBF"/>
               <w:right w:val="single" w:sz="4" w:color="BFBFBF"/>
             </w:tcBorders>
+            <w:tcMar>
+              <w:top w:w="100" w:type="dxa"/>
+              <w:bottom w:w="100" w:type="dxa"/>
+              <w:left w:w="100" w:type="dxa"/>
+              <w:right w:w="100" w:type="dxa"/>
+            </w:tcMar>
             <w:vAlign w:val="center"/>
           </w:tcPr>
           <w:p>
@@ -1845,6 +2127,12 @@
               <w:bottom w:val="single" w:sz="4" w:color="BFBFBF"/>
               <w:right w:val="single" w:sz="4" w:color="BFBFBF"/>
             </w:tcBorders>
+            <w:tcMar>
+              <w:top w:w="100" w:type="dxa"/>
+              <w:bottom w:w="100" w:type="dxa"/>
+              <w:left w:w="100" w:type="dxa"/>
+              <w:right w:w="100" w:type="dxa"/>
+            </w:tcMar>
             <w:vAlign w:val="center"/>
           </w:tcPr>
           <w:p>
@@ -1875,6 +2163,12 @@
               <w:bottom w:val="single" w:sz="4" w:color="BFBFBF"/>
               <w:right w:val="single" w:sz="4" w:color="BFBFBF"/>
             </w:tcBorders>
+            <w:tcMar>
+              <w:top w:w="100" w:type="dxa"/>
+              <w:bottom w:w="100" w:type="dxa"/>
+              <w:left w:w="100" w:type="dxa"/>
+              <w:right w:w="100" w:type="dxa"/>
+            </w:tcMar>
             <w:vAlign w:val="center"/>
           </w:tcPr>
           <w:p>
@@ -1900,6 +2194,12 @@
               <w:bottom w:val="single" w:sz="4" w:color="BFBFBF"/>
               <w:right w:val="single" w:sz="4" w:color="BFBFBF"/>
             </w:tcBorders>
+            <w:tcMar>
+              <w:top w:w="100" w:type="dxa"/>
+              <w:bottom w:w="100" w:type="dxa"/>
+              <w:left w:w="100" w:type="dxa"/>
+              <w:right w:w="100" w:type="dxa"/>
+            </w:tcMar>
             <w:vAlign w:val="center"/>
           </w:tcPr>
           <w:p>
@@ -1924,6 +2224,12 @@
               <w:bottom w:val="single" w:sz="4" w:color="BFBFBF"/>
               <w:right w:val="single" w:sz="4" w:color="BFBFBF"/>
             </w:tcBorders>
+            <w:tcMar>
+              <w:top w:w="100" w:type="dxa"/>
+              <w:bottom w:w="100" w:type="dxa"/>
+              <w:left w:w="100" w:type="dxa"/>
+              <w:right w:w="100" w:type="dxa"/>
+            </w:tcMar>
             <w:vAlign w:val="center"/>
           </w:tcPr>
           <w:p>
@@ -1948,6 +2254,12 @@
               <w:bottom w:val="single" w:sz="4" w:color="BFBFBF"/>
               <w:right w:val="single" w:sz="4" w:color="BFBFBF"/>
             </w:tcBorders>
+            <w:tcMar>
+              <w:top w:w="100" w:type="dxa"/>
+              <w:bottom w:w="100" w:type="dxa"/>
+              <w:left w:w="100" w:type="dxa"/>
+              <w:right w:w="100" w:type="dxa"/>
+            </w:tcMar>
             <w:vAlign w:val="center"/>
           </w:tcPr>
           <w:p>
@@ -2023,7 +2335,7 @@
           <w:rFonts w:ascii="Arial" w:hAnsi="Arial" w:cs="Arial"/>
           <w:b/>
           <w:i w:val="0"/>
-          <w:color w:val="1F3A5F"/>
+          <w:color w:val="2C3E50"/>
           <w:sz w:val="32"/>
         </w:rPr>
         <w:t>Approval &amp; Signatures</w:t>
@@ -2196,7 +2508,7 @@
           <w:rFonts w:ascii="Arial" w:hAnsi="Arial" w:cs="Arial"/>
           <w:b/>
           <w:i w:val="0"/>
-          <w:color w:val="1F3A5F"/>
+          <w:color w:val="2C3E50"/>
           <w:sz w:val="32"/>
         </w:rPr>
         <w:t>Approval History</w:t>
@@ -2224,6 +2536,12 @@
               <w:bottom w:val="single" w:sz="4" w:color="BFBFBF"/>
               <w:right w:val="single" w:sz="4" w:color="BFBFBF"/>
             </w:tcBorders>
+            <w:tcMar>
+              <w:top w:w="140" w:type="dxa"/>
+              <w:bottom w:w="140" w:type="dxa"/>
+              <w:left w:w="100" w:type="dxa"/>
+              <w:right w:w="100" w:type="dxa"/>
+            </w:tcMar>
             <w:vAlign w:val="center"/>
           </w:tcPr>
           <w:p>
@@ -2250,6 +2568,12 @@
               <w:bottom w:val="single" w:sz="4" w:color="BFBFBF"/>
               <w:right w:val="single" w:sz="4" w:color="BFBFBF"/>
             </w:tcBorders>
+            <w:tcMar>
+              <w:top w:w="140" w:type="dxa"/>
+              <w:bottom w:w="140" w:type="dxa"/>
+              <w:left w:w="100" w:type="dxa"/>
+              <w:right w:w="100" w:type="dxa"/>
+            </w:tcMar>
             <w:vAlign w:val="center"/>
           </w:tcPr>
           <w:p>
@@ -2276,6 +2600,12 @@
               <w:bottom w:val="single" w:sz="4" w:color="BFBFBF"/>
               <w:right w:val="single" w:sz="4" w:color="BFBFBF"/>
             </w:tcBorders>
+            <w:tcMar>
+              <w:top w:w="140" w:type="dxa"/>
+              <w:bottom w:w="140" w:type="dxa"/>
+              <w:left w:w="100" w:type="dxa"/>
+              <w:right w:w="100" w:type="dxa"/>
+            </w:tcMar>
             <w:vAlign w:val="center"/>
           </w:tcPr>
           <w:p>
@@ -2303,6 +2633,12 @@
               <w:bottom w:val="single" w:sz="4" w:color="BFBFBF"/>
               <w:right w:val="single" w:sz="4" w:color="BFBFBF"/>
             </w:tcBorders>
+            <w:tcMar>
+              <w:top w:w="100" w:type="dxa"/>
+              <w:bottom w:w="100" w:type="dxa"/>
+              <w:left w:w="100" w:type="dxa"/>
+              <w:right w:w="100" w:type="dxa"/>
+            </w:tcMar>
             <w:vAlign w:val="center"/>
           </w:tcPr>
           <w:p>
@@ -2328,6 +2664,12 @@
               <w:bottom w:val="single" w:sz="4" w:color="BFBFBF"/>
               <w:right w:val="single" w:sz="4" w:color="BFBFBF"/>
             </w:tcBorders>
+            <w:tcMar>
+              <w:top w:w="100" w:type="dxa"/>
+              <w:bottom w:w="100" w:type="dxa"/>
+              <w:left w:w="100" w:type="dxa"/>
+              <w:right w:w="100" w:type="dxa"/>
+            </w:tcMar>
             <w:vAlign w:val="center"/>
           </w:tcPr>
           <w:p>
@@ -2352,6 +2694,12 @@
               <w:bottom w:val="single" w:sz="4" w:color="BFBFBF"/>
               <w:right w:val="single" w:sz="4" w:color="BFBFBF"/>
             </w:tcBorders>
+            <w:tcMar>
+              <w:top w:w="100" w:type="dxa"/>
+              <w:bottom w:w="100" w:type="dxa"/>
+              <w:left w:w="100" w:type="dxa"/>
+              <w:right w:w="100" w:type="dxa"/>
+            </w:tcMar>
             <w:vAlign w:val="center"/>
           </w:tcPr>
           <w:p>
@@ -2378,6 +2726,12 @@
               <w:bottom w:val="single" w:sz="4" w:color="BFBFBF"/>
               <w:right w:val="single" w:sz="4" w:color="BFBFBF"/>
             </w:tcBorders>
+            <w:tcMar>
+              <w:top w:w="100" w:type="dxa"/>
+              <w:bottom w:w="100" w:type="dxa"/>
+              <w:left w:w="100" w:type="dxa"/>
+              <w:right w:w="100" w:type="dxa"/>
+            </w:tcMar>
             <w:vAlign w:val="center"/>
           </w:tcPr>
           <w:p>
@@ -2403,6 +2757,12 @@
               <w:bottom w:val="single" w:sz="4" w:color="BFBFBF"/>
               <w:right w:val="single" w:sz="4" w:color="BFBFBF"/>
             </w:tcBorders>
+            <w:tcMar>
+              <w:top w:w="100" w:type="dxa"/>
+              <w:bottom w:w="100" w:type="dxa"/>
+              <w:left w:w="100" w:type="dxa"/>
+              <w:right w:w="100" w:type="dxa"/>
+            </w:tcMar>
             <w:vAlign w:val="center"/>
           </w:tcPr>
           <w:p>
@@ -2428,6 +2788,12 @@
               <w:bottom w:val="single" w:sz="4" w:color="BFBFBF"/>
               <w:right w:val="single" w:sz="4" w:color="BFBFBF"/>
             </w:tcBorders>
+            <w:tcMar>
+              <w:top w:w="100" w:type="dxa"/>
+              <w:bottom w:w="100" w:type="dxa"/>
+              <w:left w:w="100" w:type="dxa"/>
+              <w:right w:w="100" w:type="dxa"/>
+            </w:tcMar>
             <w:vAlign w:val="center"/>
           </w:tcPr>
           <w:p>
@@ -2455,6 +2821,12 @@
               <w:bottom w:val="single" w:sz="4" w:color="BFBFBF"/>
               <w:right w:val="single" w:sz="4" w:color="BFBFBF"/>
             </w:tcBorders>
+            <w:tcMar>
+              <w:top w:w="100" w:type="dxa"/>
+              <w:bottom w:w="100" w:type="dxa"/>
+              <w:left w:w="100" w:type="dxa"/>
+              <w:right w:w="100" w:type="dxa"/>
+            </w:tcMar>
             <w:vAlign w:val="center"/>
           </w:tcPr>
           <w:p>
@@ -2480,6 +2852,12 @@
               <w:bottom w:val="single" w:sz="4" w:color="BFBFBF"/>
               <w:right w:val="single" w:sz="4" w:color="BFBFBF"/>
             </w:tcBorders>
+            <w:tcMar>
+              <w:top w:w="100" w:type="dxa"/>
+              <w:bottom w:w="100" w:type="dxa"/>
+              <w:left w:w="100" w:type="dxa"/>
+              <w:right w:w="100" w:type="dxa"/>
+            </w:tcMar>
             <w:vAlign w:val="center"/>
           </w:tcPr>
           <w:p>
@@ -2504,6 +2882,12 @@
               <w:bottom w:val="single" w:sz="4" w:color="BFBFBF"/>
               <w:right w:val="single" w:sz="4" w:color="BFBFBF"/>
             </w:tcBorders>
+            <w:tcMar>
+              <w:top w:w="100" w:type="dxa"/>
+              <w:bottom w:w="100" w:type="dxa"/>
+              <w:left w:w="100" w:type="dxa"/>
+              <w:right w:w="100" w:type="dxa"/>
+            </w:tcMar>
             <w:vAlign w:val="center"/>
           </w:tcPr>
           <w:p>

</xml_diff>

<commit_message>
chore(merge): post-merge fixups for qa-0008 ← td-0085
- Add alembic merge revision uniting qa-0008 (92481a566f44) and
  td-0085 (f0042_add_heartbeat_columns) heads.
- Regenerate sop_default.docx + batch_record_default.docx via
  qa-0008's build scripts so Jinja vars match build_context()'s
  kwargs (doc_number/purpose/scope rather than td-0085's
  document_number/purpose_text/scope_text).
- Update tests/unit/test_template_engine.py::test_sop_time_based
  to call build_context() with the qa-0008 kwarg names.
- Refresh tests/artifacts/templates/* with the merged renderer
  output so the artifact-comparison tests stay green.

Co-Authored-By: Claude Opus 4.7 <noreply@anthropic.com>
</commit_message>
<xml_diff>
--- a/backend/app/services/documents/templates/sop_default.docx
+++ b/backend/app/services/documents/templates/sop_default.docx
@@ -135,7 +135,7 @@
                 <w:color w:val="000000"/>
                 <w:sz w:val="20"/>
               </w:rPr>
-              <w:t>{{ document_number }}</w:t>
+              <w:t>{{ doc_number }}</w:t>
             </w:r>
           </w:p>
         </w:tc>
@@ -388,7 +388,7 @@
           <w:color w:val="000000"/>
           <w:sz w:val="20"/>
         </w:rPr>
-        <w:t>{{ purpose_text }}</w:t>
+        <w:t>{{ purpose }}</w:t>
       </w:r>
     </w:p>
     <w:p>
@@ -422,7 +422,7 @@
           <w:color w:val="000000"/>
           <w:sz w:val="20"/>
         </w:rPr>
-        <w:t>{{ scope_text }}</w:t>
+        <w:t>{{ scope }}</w:t>
       </w:r>
     </w:p>
     <w:p>

</xml_diff>

<commit_message>
feat(F-0087): GLP gap fixes — approval gating, sign-off polish, QAU org role
- Block GLP approval submission when graph is empty or has validation warnings (frontend + backend)
- Move floating GLP Sign-offs card into ProtocolSidebar (compact SignoffBlock layout)
- Restore SOP/Batch Record preview access on protocol page
- Add QAU org-level role + signoff dispatch logic
- Refactor ApprovalDesignator + SubmitForApprovalDialog into unified GlpSettingsPanel flow
- Playwright spec exercises full SD+QAU sign-off + creator finalisation flow with video

Co-Authored-By: Claude Opus 4.7 <noreply@anthropic.com>
</commit_message>
<xml_diff>
--- a/backend/app/services/documents/templates/sop_default.docx
+++ b/backend/app/services/documents/templates/sop_default.docx
@@ -2323,6 +2323,25 @@
           <w:color w:val="2C3E50"/>
           <w:sz w:val="32"/>
         </w:rPr>
+        <w:t xml:space="preserve">{%p if requires_approval %}</w:t>
+      </w:r>
+    </w:p>
+    <w:p>
+      <w:pPr>
+        <w:keepNext/>
+        <w:spacing w:before="320" w:after="120"/>
+        <w:pBdr>
+          <w:bottom w:val="single" w:sz="8" w:space="4" w:color="D1D5DB"/>
+        </w:pBdr>
+      </w:pPr>
+      <w:r>
+        <w:rPr>
+          <w:rFonts w:ascii="Arial" w:hAnsi="Arial" w:cs="Arial"/>
+          <w:b/>
+          <w:i w:val="0"/>
+          <w:color w:val="2C3E50"/>
+          <w:sz w:val="32"/>
+        </w:rPr>
         <w:t>Approval &amp; Signatures</w:t>
       </w:r>
     </w:p>
@@ -2914,6 +2933,25 @@
         <w:t>{%p endif %}</w:t>
       </w:r>
     </w:p>
+    <w:p>
+      <w:pPr>
+        <w:keepNext/>
+        <w:spacing w:before="320" w:after="120"/>
+        <w:pBdr>
+          <w:bottom w:val="single" w:sz="8" w:space="4" w:color="D1D5DB"/>
+        </w:pBdr>
+      </w:pPr>
+      <w:r>
+        <w:rPr>
+          <w:rFonts w:ascii="Arial" w:hAnsi="Arial" w:cs="Arial"/>
+          <w:b/>
+          <w:i w:val="0"/>
+          <w:color w:val="2C3E50"/>
+          <w:sz w:val="32"/>
+        </w:rPr>
+        <w:t xml:space="preserve">{%p endif %}</w:t>
+      </w:r>
+    </w:p>
     <w:sectPr>
       <w:pgSz w:w="12240" w:h="15840"/>
       <w:pgMar w:top="1080" w:right="1080" w:bottom="1080" w:left="1080" w:header="720" w:footer="720" w:gutter="0"/>

</xml_diff>